<commit_message>
Archivos actualizados Grupales V
</commit_message>
<xml_diff>
--- a/Fase 1/Evidencias Grupales/1.5_GuiaEstudiante_Fase 1_Definicion Proyecto APT(Español).docx
+++ b/Fase 1/Evidencias Grupales/1.5_GuiaEstudiante_Fase 1_Definicion Proyecto APT(Español).docx
@@ -910,27 +910,22 @@
           <w:p>
             <w:pPr>
               <w:rPr>
-                <w:rFonts w:ascii="Segoe UI" w:hAnsi="Segoe UI" w:cs="Segoe UI"/>
-                <w:color w:val="000000"/>
-              </w:rPr>
-            </w:pPr>
-            <w:r>
-              <w:rPr>
-                <w:rFonts w:ascii="Arial" w:hAnsi="Arial" w:cs="Arial"/>
-                <w:color w:val="000000"/>
-                <w:sz w:val="16"/>
-                <w:szCs w:val="16"/>
-              </w:rPr>
-              <w:br/>
-            </w:r>
-            <w:r>
-              <w:rPr>
-                <w:rFonts w:ascii="Calibri" w:hAnsi="Calibri" w:cs="Arial"/>
-                <w:i/>
-                <w:color w:val="548DD4"/>
-                <w:sz w:val="20"/>
-                <w:szCs w:val="20"/>
-                <w:lang w:eastAsia="es-CL"/>
+                <w:rFonts w:ascii="Calibri" w:hAnsi="Calibri" w:cs="Arial"/>
+                <w:i/>
+                <w:color w:val="548DD4"/>
+                <w:sz w:val="20"/>
+                <w:szCs w:val="20"/>
+                <w:lang w:eastAsia="es-CL"/>
+              </w:rPr>
+            </w:pPr>
+            <w:r>
+              <w:rPr>
+                <w:rFonts w:ascii="Calibri" w:hAnsi="Calibri" w:cs="Calibri"/>
+                <w:i/>
+                <w:iCs/>
+                <w:color w:val="548DD4"/>
+                <w:sz w:val="20"/>
+                <w:szCs w:val="20"/>
               </w:rPr>
               <w:t>Desarrollo de software, ciberseguridad, gestión de riesgos, cumplimiento, calidad de software y gestión de proyectos informáticos.</w:t>
             </w:r>
@@ -1238,8 +1233,9 @@
                 <w:szCs w:val="20"/>
                 <w:lang w:eastAsia="es-CL"/>
               </w:rPr>
-              <w:t>, actualmente orientada a la gestión de ISO 27001, incorporando en el mismo software las funcionalidades necesarias para gestionar ISO 42001. El proyecto no contempla construir una plataforma nueva ni reemplazar la solución existente, sino reutilizar su arquitectura, componentes y flujos para extender su alcance hacia la gestión de sistemas de inteligencia artificial.</w:t>
-            </w:r>
+              <w:t xml:space="preserve">, actualmente orientada a la gestión de ISO 27001, incorporando un nuevo </w:t>
+            </w:r>
+            <w:proofErr w:type="spellStart"/>
             <w:r>
               <w:rPr>
                 <w:rFonts w:ascii="Calibri" w:hAnsi="Calibri" w:cs="Arial"/>
@@ -1250,6 +1246,31 @@
                 <w:szCs w:val="20"/>
                 <w:lang w:eastAsia="es-CL"/>
               </w:rPr>
+              <w:t>framework</w:t>
+            </w:r>
+            <w:proofErr w:type="spellEnd"/>
+            <w:r>
+              <w:rPr>
+                <w:rFonts w:ascii="Calibri" w:hAnsi="Calibri" w:cs="Arial"/>
+                <w:i/>
+                <w:iCs/>
+                <w:color w:val="548DD4"/>
+                <w:sz w:val="20"/>
+                <w:szCs w:val="20"/>
+                <w:lang w:eastAsia="es-CL"/>
+              </w:rPr>
+              <w:t xml:space="preserve"> para ISO 42001. El alcance se concentra en automatizar e integrar en el software los requerimientos documentales asociados a este marco, reutilizando la arquitectura y los componentes ya existentes.</w:t>
+            </w:r>
+            <w:r>
+              <w:rPr>
+                <w:rFonts w:ascii="Calibri" w:hAnsi="Calibri" w:cs="Arial"/>
+                <w:i/>
+                <w:iCs/>
+                <w:color w:val="548DD4"/>
+                <w:sz w:val="20"/>
+                <w:szCs w:val="20"/>
+                <w:lang w:eastAsia="es-CL"/>
+              </w:rPr>
               <w:br/>
             </w:r>
             <w:r>
@@ -1263,7 +1284,7 @@
                 <w:lang w:eastAsia="es-CL"/>
               </w:rPr>
               <w:br/>
-              <w:t xml:space="preserve">La integración deberá respetar los lineamientos técnicos ya definidos por </w:t>
+              <w:t xml:space="preserve">De acuerdo con el inventario normativo entregado por </w:t>
             </w:r>
             <w:proofErr w:type="spellStart"/>
             <w:r>
@@ -1289,7 +1310,7 @@
                 <w:szCs w:val="20"/>
                 <w:lang w:eastAsia="es-CL"/>
               </w:rPr>
-              <w:t xml:space="preserve">, entre ellos </w:t>
+              <w:t xml:space="preserve">, ISO 42001 contempla 58 exigencias documentales: 20 políticas, 22 procedimientos y 16 controles. Para el alcance priorizado del Proyecto APT se trabajará sobre las 20 políticas asociadas a ISO 42001, dejando la solución preparada bajo un esquema de </w:t>
             </w:r>
             <w:proofErr w:type="spellStart"/>
             <w:r>
@@ -1302,6 +1323,57 @@
                 <w:szCs w:val="20"/>
                 <w:lang w:eastAsia="es-CL"/>
               </w:rPr>
+              <w:t>frameworks</w:t>
+            </w:r>
+            <w:proofErr w:type="spellEnd"/>
+            <w:r>
+              <w:rPr>
+                <w:rFonts w:ascii="Calibri" w:hAnsi="Calibri" w:cs="Arial"/>
+                <w:i/>
+                <w:iCs/>
+                <w:color w:val="548DD4"/>
+                <w:sz w:val="20"/>
+                <w:szCs w:val="20"/>
+                <w:lang w:eastAsia="es-CL"/>
+              </w:rPr>
+              <w:t xml:space="preserve"> reutilizable y extensible para futuras normas o marcos normativos.</w:t>
+            </w:r>
+            <w:r>
+              <w:rPr>
+                <w:rFonts w:ascii="Calibri" w:hAnsi="Calibri" w:cs="Arial"/>
+                <w:i/>
+                <w:iCs/>
+                <w:color w:val="548DD4"/>
+                <w:sz w:val="20"/>
+                <w:szCs w:val="20"/>
+                <w:lang w:eastAsia="es-CL"/>
+              </w:rPr>
+              <w:br/>
+            </w:r>
+            <w:r>
+              <w:rPr>
+                <w:rFonts w:ascii="Calibri" w:hAnsi="Calibri" w:cs="Arial"/>
+                <w:i/>
+                <w:iCs/>
+                <w:color w:val="548DD4"/>
+                <w:sz w:val="20"/>
+                <w:szCs w:val="20"/>
+                <w:lang w:eastAsia="es-CL"/>
+              </w:rPr>
+              <w:br/>
+              <w:t xml:space="preserve">La implementación deberá respetar los lineamientos técnicos de la plataforma: </w:t>
+            </w:r>
+            <w:proofErr w:type="spellStart"/>
+            <w:r>
+              <w:rPr>
+                <w:rFonts w:ascii="Calibri" w:hAnsi="Calibri" w:cs="Arial"/>
+                <w:i/>
+                <w:iCs/>
+                <w:color w:val="548DD4"/>
+                <w:sz w:val="20"/>
+                <w:szCs w:val="20"/>
+                <w:lang w:eastAsia="es-CL"/>
+              </w:rPr>
               <w:t>multi-tenancy</w:t>
             </w:r>
             <w:proofErr w:type="spellEnd"/>
@@ -1315,7 +1387,7 @@
                 <w:szCs w:val="20"/>
                 <w:lang w:eastAsia="es-CL"/>
               </w:rPr>
-              <w:t xml:space="preserve"> y aislamiento de datos mediante </w:t>
+              <w:t xml:space="preserve"> mediante </w:t>
             </w:r>
             <w:proofErr w:type="spellStart"/>
             <w:r>
@@ -1341,7 +1413,59 @@
                 <w:szCs w:val="20"/>
                 <w:lang w:eastAsia="es-CL"/>
               </w:rPr>
-              <w:t>, control de funcionalidades según perfil comercial, RBAC granular y autenticación JWT, internacionalización, arquitectura API-First y auditoría y trazabilidad mediante logs. De esta forma, la incorporación de ISO 42001 se realizará procurando mantener la operación existente asociada a ISO 27001.</w:t>
+              <w:t xml:space="preserve">, </w:t>
+            </w:r>
+            <w:proofErr w:type="spellStart"/>
+            <w:r>
+              <w:rPr>
+                <w:rFonts w:ascii="Calibri" w:hAnsi="Calibri" w:cs="Arial"/>
+                <w:i/>
+                <w:iCs/>
+                <w:color w:val="548DD4"/>
+                <w:sz w:val="20"/>
+                <w:szCs w:val="20"/>
+                <w:lang w:eastAsia="es-CL"/>
+              </w:rPr>
+              <w:t>Feature</w:t>
+            </w:r>
+            <w:proofErr w:type="spellEnd"/>
+            <w:r>
+              <w:rPr>
+                <w:rFonts w:ascii="Calibri" w:hAnsi="Calibri" w:cs="Arial"/>
+                <w:i/>
+                <w:iCs/>
+                <w:color w:val="548DD4"/>
+                <w:sz w:val="20"/>
+                <w:szCs w:val="20"/>
+                <w:lang w:eastAsia="es-CL"/>
+              </w:rPr>
+              <w:t xml:space="preserve"> </w:t>
+            </w:r>
+            <w:proofErr w:type="spellStart"/>
+            <w:r>
+              <w:rPr>
+                <w:rFonts w:ascii="Calibri" w:hAnsi="Calibri" w:cs="Arial"/>
+                <w:i/>
+                <w:iCs/>
+                <w:color w:val="548DD4"/>
+                <w:sz w:val="20"/>
+                <w:szCs w:val="20"/>
+                <w:lang w:eastAsia="es-CL"/>
+              </w:rPr>
+              <w:t>Gating</w:t>
+            </w:r>
+            <w:proofErr w:type="spellEnd"/>
+            <w:r>
+              <w:rPr>
+                <w:rFonts w:ascii="Calibri" w:hAnsi="Calibri" w:cs="Arial"/>
+                <w:i/>
+                <w:iCs/>
+                <w:color w:val="548DD4"/>
+                <w:sz w:val="20"/>
+                <w:szCs w:val="20"/>
+                <w:lang w:eastAsia="es-CL"/>
+              </w:rPr>
+              <w:t>, RBAC y JWT, internacionalización, arquitectura API-First y auditoría y trazabilidad mediante logs.</w:t>
             </w:r>
           </w:p>
         </w:tc>
@@ -1405,7 +1529,7 @@
                 <w:szCs w:val="20"/>
                 <w:lang w:eastAsia="es-CL"/>
               </w:rPr>
-              <w:t xml:space="preserve">Dani ISO 42001 consiste en implementar dentro del software existente de </w:t>
+              <w:t xml:space="preserve">Dani ISO 42001 consiste en adaptar el software DANI27 para incorporar ISO 42001 como un </w:t>
             </w:r>
             <w:proofErr w:type="spellStart"/>
             <w:r>
@@ -1417,7 +1541,7 @@
                 <w:szCs w:val="20"/>
                 <w:lang w:eastAsia="es-CL"/>
               </w:rPr>
-              <w:t>Alloxentric</w:t>
+              <w:t>framework</w:t>
             </w:r>
             <w:proofErr w:type="spellEnd"/>
             <w:r>
@@ -1429,7 +1553,7 @@
                 <w:szCs w:val="20"/>
                 <w:lang w:eastAsia="es-CL"/>
               </w:rPr>
-              <w:t xml:space="preserve"> las funcionalidades requeridas para incorporar la gestión de ISO 42001, tomando como base la solución actualmente utilizada para ISO 27001.</w:t>
+              <w:t xml:space="preserve"> configurable dentro de la plataforma existente. El requerimiento principal del proyecto es implementar y automatizar las 20 políticas identificadas para ISO 42001 en el inventario normativo entregado, evitando desarrollar una solución independiente o codificada exclusivamente para una sola norma.</w:t>
             </w:r>
             <w:r>
               <w:rPr>
@@ -1452,7 +1576,7 @@
                 <w:lang w:eastAsia="es-CL"/>
               </w:rPr>
               <w:br/>
-              <w:t xml:space="preserve">El trabajo considera analizar la plataforma actual, identificar componentes reutilizables, levantar y priorizar requerimientos, diseñar la integración, desarrollar las funcionalidades necesarias y realizar pruebas funcionales y de integración. La solución deberá conservar la arquitectura tecnológica existente y los estándares transversales definidos por </w:t>
+              <w:t xml:space="preserve">El trabajo considera analizar la implementación actual de ISO 27001, diseñar una estructura de datos y lógica reutilizable para </w:t>
             </w:r>
             <w:proofErr w:type="spellStart"/>
             <w:r>
@@ -1464,7 +1588,7 @@
                 <w:szCs w:val="20"/>
                 <w:lang w:eastAsia="es-CL"/>
               </w:rPr>
-              <w:t>Alloxentric</w:t>
+              <w:t>frameworks</w:t>
             </w:r>
             <w:proofErr w:type="spellEnd"/>
             <w:r>
@@ -1476,7 +1600,55 @@
                 <w:szCs w:val="20"/>
                 <w:lang w:eastAsia="es-CL"/>
               </w:rPr>
-              <w:t>.</w:t>
+              <w:t xml:space="preserve">, cargar y relacionar las 20 políticas de ISO 42001, adaptar </w:t>
+            </w:r>
+            <w:proofErr w:type="spellStart"/>
+            <w:r>
+              <w:rPr>
+                <w:rFonts w:ascii="Calibri" w:hAnsi="Calibri" w:cs="Arial"/>
+                <w:i/>
+                <w:color w:val="548DD4"/>
+                <w:sz w:val="20"/>
+                <w:szCs w:val="20"/>
+                <w:lang w:eastAsia="es-CL"/>
+              </w:rPr>
+              <w:t>backend</w:t>
+            </w:r>
+            <w:proofErr w:type="spellEnd"/>
+            <w:r>
+              <w:rPr>
+                <w:rFonts w:ascii="Calibri" w:hAnsi="Calibri" w:cs="Arial"/>
+                <w:i/>
+                <w:color w:val="548DD4"/>
+                <w:sz w:val="20"/>
+                <w:szCs w:val="20"/>
+                <w:lang w:eastAsia="es-CL"/>
+              </w:rPr>
+              <w:t xml:space="preserve"> y </w:t>
+            </w:r>
+            <w:proofErr w:type="spellStart"/>
+            <w:r>
+              <w:rPr>
+                <w:rFonts w:ascii="Calibri" w:hAnsi="Calibri" w:cs="Arial"/>
+                <w:i/>
+                <w:color w:val="548DD4"/>
+                <w:sz w:val="20"/>
+                <w:szCs w:val="20"/>
+                <w:lang w:eastAsia="es-CL"/>
+              </w:rPr>
+              <w:t>frontend</w:t>
+            </w:r>
+            <w:proofErr w:type="spellEnd"/>
+            <w:r>
+              <w:rPr>
+                <w:rFonts w:ascii="Calibri" w:hAnsi="Calibri" w:cs="Arial"/>
+                <w:i/>
+                <w:color w:val="548DD4"/>
+                <w:sz w:val="20"/>
+                <w:szCs w:val="20"/>
+                <w:lang w:eastAsia="es-CL"/>
+              </w:rPr>
+              <w:t xml:space="preserve"> para su gestión, y validar que cada política pueda ser consultada, gestionada y trazada dentro del sistema.</w:t>
             </w:r>
             <w:r>
               <w:rPr>
@@ -1499,7 +1671,7 @@
                 <w:lang w:eastAsia="es-CL"/>
               </w:rPr>
               <w:br/>
-              <w:t>El resultado esperado es una ampliación de DANI27 que permita trabajar con ISO 27001 e ISO 42001 dentro de una misma plataforma, evitando desarrollar un sistema independiente desde cero.</w:t>
+              <w:t>La arquitectura deberá permitir que en el futuro puedan incorporarse nuevas normas o marcos sin reconstruir los módulos principales de la aplicación.</w:t>
             </w:r>
           </w:p>
         </w:tc>
@@ -1563,7 +1735,79 @@
                 <w:szCs w:val="20"/>
                 <w:lang w:eastAsia="es-CL"/>
               </w:rPr>
-              <w:t>El proyecto se relaciona directamente con el perfil de egreso de Ingeniería en Informática, ya que requiere analizar requerimientos, comprender y adaptar una arquitectura de software existente, desarrollar e integrar funcionalidades, gestionar datos, aplicar criterios de calidad y seguridad, ejecutar pruebas y organizar el trabajo mediante una metodología de gestión de proyectos.</w:t>
+              <w:t xml:space="preserve">El proyecto se relaciona directamente con el perfil de egreso de Ingeniería en Informática, ya que requiere análisis de requerimientos, modelamiento de datos, comprensión y adaptación de una arquitectura existente, programación </w:t>
+            </w:r>
+            <w:proofErr w:type="spellStart"/>
+            <w:r>
+              <w:rPr>
+                <w:rFonts w:ascii="Calibri" w:hAnsi="Calibri" w:cs="Arial"/>
+                <w:i/>
+                <w:color w:val="548DD4"/>
+                <w:sz w:val="20"/>
+                <w:szCs w:val="20"/>
+                <w:lang w:eastAsia="es-CL"/>
+              </w:rPr>
+              <w:t>backend</w:t>
+            </w:r>
+            <w:proofErr w:type="spellEnd"/>
+            <w:r>
+              <w:rPr>
+                <w:rFonts w:ascii="Calibri" w:hAnsi="Calibri" w:cs="Arial"/>
+                <w:i/>
+                <w:color w:val="548DD4"/>
+                <w:sz w:val="20"/>
+                <w:szCs w:val="20"/>
+                <w:lang w:eastAsia="es-CL"/>
+              </w:rPr>
+              <w:t xml:space="preserve"> y </w:t>
+            </w:r>
+            <w:proofErr w:type="spellStart"/>
+            <w:r>
+              <w:rPr>
+                <w:rFonts w:ascii="Calibri" w:hAnsi="Calibri" w:cs="Arial"/>
+                <w:i/>
+                <w:color w:val="548DD4"/>
+                <w:sz w:val="20"/>
+                <w:szCs w:val="20"/>
+                <w:lang w:eastAsia="es-CL"/>
+              </w:rPr>
+              <w:t>frontend</w:t>
+            </w:r>
+            <w:proofErr w:type="spellEnd"/>
+            <w:r>
+              <w:rPr>
+                <w:rFonts w:ascii="Calibri" w:hAnsi="Calibri" w:cs="Arial"/>
+                <w:i/>
+                <w:color w:val="548DD4"/>
+                <w:sz w:val="20"/>
+                <w:szCs w:val="20"/>
+                <w:lang w:eastAsia="es-CL"/>
+              </w:rPr>
+              <w:t xml:space="preserve">, integración de </w:t>
+            </w:r>
+            <w:proofErr w:type="spellStart"/>
+            <w:r>
+              <w:rPr>
+                <w:rFonts w:ascii="Calibri" w:hAnsi="Calibri" w:cs="Arial"/>
+                <w:i/>
+                <w:color w:val="548DD4"/>
+                <w:sz w:val="20"/>
+                <w:szCs w:val="20"/>
+                <w:lang w:eastAsia="es-CL"/>
+              </w:rPr>
+              <w:t>APIs</w:t>
+            </w:r>
+            <w:proofErr w:type="spellEnd"/>
+            <w:r>
+              <w:rPr>
+                <w:rFonts w:ascii="Calibri" w:hAnsi="Calibri" w:cs="Arial"/>
+                <w:i/>
+                <w:color w:val="548DD4"/>
+                <w:sz w:val="20"/>
+                <w:szCs w:val="20"/>
+                <w:lang w:eastAsia="es-CL"/>
+              </w:rPr>
+              <w:t>, control de acceso, pruebas de software y gestión de proyecto.</w:t>
             </w:r>
             <w:r>
               <w:rPr>
@@ -1586,7 +1830,31 @@
                 <w:lang w:eastAsia="es-CL"/>
               </w:rPr>
               <w:br/>
-              <w:t>Además, al desarrollarse en equipo, permite distribuir responsabilidades técnicas y funcionales, mantener trazabilidad sobre los aportes de cada integrante y aplicar prácticas de colaboración, control de versiones e integración continua del trabajo.</w:t>
+              <w:t xml:space="preserve">Además, el diseño orientado a </w:t>
+            </w:r>
+            <w:proofErr w:type="spellStart"/>
+            <w:r>
+              <w:rPr>
+                <w:rFonts w:ascii="Calibri" w:hAnsi="Calibri" w:cs="Arial"/>
+                <w:i/>
+                <w:color w:val="548DD4"/>
+                <w:sz w:val="20"/>
+                <w:szCs w:val="20"/>
+                <w:lang w:eastAsia="es-CL"/>
+              </w:rPr>
+              <w:t>frameworks</w:t>
+            </w:r>
+            <w:proofErr w:type="spellEnd"/>
+            <w:r>
+              <w:rPr>
+                <w:rFonts w:ascii="Calibri" w:hAnsi="Calibri" w:cs="Arial"/>
+                <w:i/>
+                <w:color w:val="548DD4"/>
+                <w:sz w:val="20"/>
+                <w:szCs w:val="20"/>
+                <w:lang w:eastAsia="es-CL"/>
+              </w:rPr>
+              <w:t xml:space="preserve"> exige aplicar criterios de mantenibilidad, escalabilidad y reutilización, permitiendo que una misma base tecnológica soporte distintos marcos normativos.</w:t>
             </w:r>
           </w:p>
         </w:tc>
@@ -1643,30 +1911,7 @@
                 <w:szCs w:val="20"/>
                 <w:lang w:eastAsia="es-CL"/>
               </w:rPr>
-              <w:t>El proyecto se vincula con los intereses profesionales del equipo por su relación con el desarrollo de software, la ciberseguridad, la gestión de riesgos, el cumplimiento y la implementación de controles en soluciones tecnológicas.</w:t>
-            </w:r>
-            <w:r>
-              <w:rPr>
-                <w:rFonts w:ascii="Calibri" w:hAnsi="Calibri" w:cs="Arial"/>
-                <w:i/>
-                <w:color w:val="548DD4"/>
-                <w:sz w:val="20"/>
-                <w:szCs w:val="20"/>
-                <w:lang w:eastAsia="es-CL"/>
-              </w:rPr>
-              <w:br/>
-            </w:r>
-            <w:r>
-              <w:rPr>
-                <w:rFonts w:ascii="Calibri" w:hAnsi="Calibri" w:cs="Arial"/>
-                <w:i/>
-                <w:color w:val="548DD4"/>
-                <w:sz w:val="20"/>
-                <w:szCs w:val="20"/>
-                <w:lang w:eastAsia="es-CL"/>
-              </w:rPr>
-              <w:br/>
-              <w:t>También representa una oportunidad para fortalecer competencias en programación, arquitectura de software, análisis de requerimientos, pruebas, documentación técnica y trabajo colaborativo sobre una plataforma real.</w:t>
+              <w:t>El proyecto se vincula con los intereses profesionales del equipo por su relación con desarrollo de software, ciberseguridad, cumplimiento y automatización de controles y documentación normativa. También permite fortalecer competencias en programación, arquitectura de software, modelamiento de datos, pruebas y trabajo colaborativo sobre una plataforma real.</w:t>
             </w:r>
           </w:p>
         </w:tc>
@@ -1722,7 +1967,7 @@
                 <w:szCs w:val="20"/>
                 <w:lang w:eastAsia="es-CL"/>
               </w:rPr>
-              <w:t xml:space="preserve">El proyecto es factible porque no parte desde cero. </w:t>
+              <w:t xml:space="preserve">El proyecto es factible porque DANI27 ya dispone de una base funcional para ISO 27001 y de una arquitectura implementada con </w:t>
             </w:r>
             <w:proofErr w:type="spellStart"/>
             <w:r>
@@ -1734,7 +1979,7 @@
                 <w:szCs w:val="20"/>
                 <w:lang w:eastAsia="es-CL"/>
               </w:rPr>
-              <w:t>Alloxentric</w:t>
+              <w:t>React</w:t>
             </w:r>
             <w:proofErr w:type="spellEnd"/>
             <w:r>
@@ -1746,7 +1991,7 @@
                 <w:szCs w:val="20"/>
                 <w:lang w:eastAsia="es-CL"/>
               </w:rPr>
-              <w:t xml:space="preserve"> dispone de la plataforma DANI27 y del repositorio de la solución, cuya base tecnológica utiliza </w:t>
+              <w:t xml:space="preserve"> + Vite, </w:t>
             </w:r>
             <w:proofErr w:type="spellStart"/>
             <w:r>
@@ -1758,7 +2003,7 @@
                 <w:szCs w:val="20"/>
                 <w:lang w:eastAsia="es-CL"/>
               </w:rPr>
-              <w:t>React</w:t>
+              <w:t>FastAPI</w:t>
             </w:r>
             <w:proofErr w:type="spellEnd"/>
             <w:r>
@@ -1770,7 +2015,7 @@
                 <w:szCs w:val="20"/>
                 <w:lang w:eastAsia="es-CL"/>
               </w:rPr>
-              <w:t xml:space="preserve"> + Vite en </w:t>
+              <w:t xml:space="preserve">, PostgreSQL con </w:t>
             </w:r>
             <w:proofErr w:type="spellStart"/>
             <w:r>
@@ -1782,7 +2027,7 @@
                 <w:szCs w:val="20"/>
                 <w:lang w:eastAsia="es-CL"/>
               </w:rPr>
-              <w:t>frontend</w:t>
+              <w:t>pgvector</w:t>
             </w:r>
             <w:proofErr w:type="spellEnd"/>
             <w:r>
@@ -1794,7 +2039,7 @@
                 <w:szCs w:val="20"/>
                 <w:lang w:eastAsia="es-CL"/>
               </w:rPr>
-              <w:t xml:space="preserve">, </w:t>
+              <w:t xml:space="preserve">, Redis, </w:t>
             </w:r>
             <w:proofErr w:type="spellStart"/>
             <w:r>
@@ -1806,7 +2051,7 @@
                 <w:szCs w:val="20"/>
                 <w:lang w:eastAsia="es-CL"/>
               </w:rPr>
-              <w:t>FastAPI</w:t>
+              <w:t>Celery</w:t>
             </w:r>
             <w:proofErr w:type="spellEnd"/>
             <w:r>
@@ -1818,7 +2063,7 @@
                 <w:szCs w:val="20"/>
                 <w:lang w:eastAsia="es-CL"/>
               </w:rPr>
-              <w:t xml:space="preserve"> (Python) en </w:t>
+              <w:t xml:space="preserve"> y Docker. Por lo tanto, el trabajo se concentra en generalizar y reutilizar componentes para soportar ISO 42001 como un nuevo </w:t>
             </w:r>
             <w:proofErr w:type="spellStart"/>
             <w:r>
@@ -1830,7 +2075,7 @@
                 <w:szCs w:val="20"/>
                 <w:lang w:eastAsia="es-CL"/>
               </w:rPr>
-              <w:t>backend</w:t>
+              <w:t>framework</w:t>
             </w:r>
             <w:proofErr w:type="spellEnd"/>
             <w:r>
@@ -1842,7 +2087,30 @@
                 <w:szCs w:val="20"/>
                 <w:lang w:eastAsia="es-CL"/>
               </w:rPr>
-              <w:t xml:space="preserve">, PostgreSQL con </w:t>
+              <w:t>.</w:t>
+            </w:r>
+            <w:r>
+              <w:rPr>
+                <w:rFonts w:ascii="Calibri" w:hAnsi="Calibri" w:cs="Arial"/>
+                <w:i/>
+                <w:color w:val="548DD4"/>
+                <w:sz w:val="20"/>
+                <w:szCs w:val="20"/>
+                <w:lang w:eastAsia="es-CL"/>
+              </w:rPr>
+              <w:br/>
+            </w:r>
+            <w:r>
+              <w:rPr>
+                <w:rFonts w:ascii="Calibri" w:hAnsi="Calibri" w:cs="Arial"/>
+                <w:i/>
+                <w:color w:val="548DD4"/>
+                <w:sz w:val="20"/>
+                <w:szCs w:val="20"/>
+                <w:lang w:eastAsia="es-CL"/>
+              </w:rPr>
+              <w:br/>
+              <w:t xml:space="preserve">El alcance priorizado de 20 políticas permite dividir el trabajo entre Vicente Suazo y Andrea Santana, realizar entregas incrementales durante las 18 semanas y validar progresivamente la incorporación de cada grupo de políticas. El uso de una estructura basada en </w:t>
             </w:r>
             <w:proofErr w:type="spellStart"/>
             <w:r>
@@ -1854,7 +2122,7 @@
                 <w:szCs w:val="20"/>
                 <w:lang w:eastAsia="es-CL"/>
               </w:rPr>
-              <w:t>pgvector</w:t>
+              <w:t>frameworks</w:t>
             </w:r>
             <w:proofErr w:type="spellEnd"/>
             <w:r>
@@ -1866,78 +2134,7 @@
                 <w:szCs w:val="20"/>
                 <w:lang w:eastAsia="es-CL"/>
               </w:rPr>
-              <w:t xml:space="preserve">, Redis, </w:t>
-            </w:r>
-            <w:proofErr w:type="spellStart"/>
-            <w:r>
-              <w:rPr>
-                <w:rFonts w:ascii="Calibri" w:hAnsi="Calibri" w:cs="Arial"/>
-                <w:i/>
-                <w:color w:val="548DD4"/>
-                <w:sz w:val="20"/>
-                <w:szCs w:val="20"/>
-                <w:lang w:eastAsia="es-CL"/>
-              </w:rPr>
-              <w:t>Celery</w:t>
-            </w:r>
-            <w:proofErr w:type="spellEnd"/>
-            <w:r>
-              <w:rPr>
-                <w:rFonts w:ascii="Calibri" w:hAnsi="Calibri" w:cs="Arial"/>
-                <w:i/>
-                <w:color w:val="548DD4"/>
-                <w:sz w:val="20"/>
-                <w:szCs w:val="20"/>
-                <w:lang w:eastAsia="es-CL"/>
-              </w:rPr>
-              <w:t xml:space="preserve"> y Docker. Esto permite concentrar el esfuerzo en adaptar e integrar ISO 42001 sobre componentes existentes.</w:t>
-            </w:r>
-            <w:r>
-              <w:rPr>
-                <w:rFonts w:ascii="Calibri" w:hAnsi="Calibri" w:cs="Arial"/>
-                <w:i/>
-                <w:color w:val="548DD4"/>
-                <w:sz w:val="20"/>
-                <w:szCs w:val="20"/>
-                <w:lang w:eastAsia="es-CL"/>
-              </w:rPr>
-              <w:br/>
-            </w:r>
-            <w:r>
-              <w:rPr>
-                <w:rFonts w:ascii="Calibri" w:hAnsi="Calibri" w:cs="Arial"/>
-                <w:i/>
-                <w:color w:val="548DD4"/>
-                <w:sz w:val="20"/>
-                <w:szCs w:val="20"/>
-                <w:lang w:eastAsia="es-CL"/>
-              </w:rPr>
-              <w:br/>
-              <w:t xml:space="preserve">La factibilidad también se sustenta en que </w:t>
-            </w:r>
-            <w:proofErr w:type="spellStart"/>
-            <w:r>
-              <w:rPr>
-                <w:rFonts w:ascii="Calibri" w:hAnsi="Calibri" w:cs="Arial"/>
-                <w:i/>
-                <w:color w:val="548DD4"/>
-                <w:sz w:val="20"/>
-                <w:szCs w:val="20"/>
-                <w:lang w:eastAsia="es-CL"/>
-              </w:rPr>
-              <w:t>Alloxentric</w:t>
-            </w:r>
-            <w:proofErr w:type="spellEnd"/>
-            <w:r>
-              <w:rPr>
-                <w:rFonts w:ascii="Calibri" w:hAnsi="Calibri" w:cs="Arial"/>
-                <w:i/>
-                <w:color w:val="548DD4"/>
-                <w:sz w:val="20"/>
-                <w:szCs w:val="20"/>
-                <w:lang w:eastAsia="es-CL"/>
-              </w:rPr>
-              <w:t xml:space="preserve"> ya definió estándares técnicos transversales para la plataforma y el equipo realizará revisiones semanales bajo un enfoque Scrum. La planificación divide responsabilidades entre Vicente Suazo y Andrea Santana para que cada integrante cuente con tareas y evidencias diferenciables durante las tres fases del proyecto.</w:t>
+              <w:t xml:space="preserve"> reduce la dependencia de lógica específica por norma y facilita futuras ampliaciones.</w:t>
             </w:r>
           </w:p>
         </w:tc>
@@ -2164,7 +2361,7 @@
                 <w:szCs w:val="20"/>
                 <w:lang w:eastAsia="es-CL"/>
               </w:rPr>
-              <w:t xml:space="preserve">Implementar en el software existente de </w:t>
+              <w:t xml:space="preserve">Implementar en la plataforma DANI27 de </w:t>
             </w:r>
             <w:proofErr w:type="spellStart"/>
             <w:r>
@@ -2188,7 +2385,31 @@
                 <w:szCs w:val="20"/>
                 <w:lang w:eastAsia="es-CL"/>
               </w:rPr>
-              <w:t xml:space="preserve"> las funcionalidades necesarias para incorporar la gestión de ISO 42001, reutilizando y adaptando la solución actualmente utilizada para ISO 27001 y manteniendo los estándares técnicos definidos por la empresa.</w:t>
+              <w:t xml:space="preserve"> un esquema de </w:t>
+            </w:r>
+            <w:proofErr w:type="spellStart"/>
+            <w:r>
+              <w:rPr>
+                <w:rFonts w:ascii="Calibri" w:hAnsi="Calibri" w:cs="Arial"/>
+                <w:i/>
+                <w:color w:val="548DD4"/>
+                <w:sz w:val="20"/>
+                <w:szCs w:val="20"/>
+                <w:lang w:eastAsia="es-CL"/>
+              </w:rPr>
+              <w:t>frameworks</w:t>
+            </w:r>
+            <w:proofErr w:type="spellEnd"/>
+            <w:r>
+              <w:rPr>
+                <w:rFonts w:ascii="Calibri" w:hAnsi="Calibri" w:cs="Arial"/>
+                <w:i/>
+                <w:color w:val="548DD4"/>
+                <w:sz w:val="20"/>
+                <w:szCs w:val="20"/>
+                <w:lang w:eastAsia="es-CL"/>
+              </w:rPr>
+              <w:t xml:space="preserve"> que permita incorporar y gestionar ISO 42001, automatizando las 20 políticas asociadas a este marco normativo y reutilizando la arquitectura existente para facilitar la incorporación futura de nuevas normas.</w:t>
             </w:r>
           </w:p>
         </w:tc>
@@ -2251,23 +2472,26 @@
             </w:pPr>
             <w:r>
               <w:rPr>
-                <w:rFonts w:ascii="Arial" w:hAnsi="Arial" w:cs="Arial"/>
-                <w:color w:val="000000"/>
-                <w:sz w:val="18"/>
-                <w:szCs w:val="18"/>
+                <w:rFonts w:ascii="Calibri" w:hAnsi="Calibri" w:cs="Arial"/>
+                <w:i/>
+                <w:color w:val="548DD4"/>
+                <w:sz w:val="20"/>
+                <w:szCs w:val="20"/>
+                <w:lang w:eastAsia="es-CL"/>
+              </w:rPr>
+              <w:t>1. Analizar la arquitectura y los módulos actuales de DANI27 para identificar componentes reutilizables y dependencias específicas de ISO 27001.</w:t>
+            </w:r>
+            <w:r>
+              <w:rPr>
+                <w:rFonts w:ascii="Calibri" w:hAnsi="Calibri" w:cs="Arial"/>
+                <w:i/>
+                <w:color w:val="548DD4"/>
+                <w:sz w:val="20"/>
+                <w:szCs w:val="20"/>
+                <w:lang w:eastAsia="es-CL"/>
               </w:rPr>
               <w:br/>
-            </w:r>
-            <w:r>
-              <w:rPr>
-                <w:rFonts w:ascii="Calibri" w:hAnsi="Calibri" w:cs="Arial"/>
-                <w:i/>
-                <w:color w:val="548DD4"/>
-                <w:sz w:val="20"/>
-                <w:szCs w:val="20"/>
-                <w:lang w:eastAsia="es-CL"/>
-              </w:rPr>
-              <w:t xml:space="preserve">1. Analizar la estructura y el funcionamiento actual del software de </w:t>
+              <w:t xml:space="preserve">2. Analizar y estructurar las 20 políticas asociadas a ISO 42001 definidas en el inventario normativo entregado por </w:t>
             </w:r>
             <w:proofErr w:type="spellStart"/>
             <w:r>
@@ -2291,7 +2515,7 @@
                 <w:szCs w:val="20"/>
                 <w:lang w:eastAsia="es-CL"/>
               </w:rPr>
-              <w:t xml:space="preserve"> utilizado para la gestión de ISO 27001, identificando componentes reutilizables o adaptables.</w:t>
+              <w:t>.</w:t>
             </w:r>
             <w:r>
               <w:rPr>
@@ -2303,7 +2527,31 @@
                 <w:lang w:eastAsia="es-CL"/>
               </w:rPr>
               <w:br/>
-              <w:t>2. Identificar y definir los requerimientos funcionales y técnicos necesarios para incorporar la gestión de ISO 42001 en la plataforma existente.</w:t>
+              <w:t xml:space="preserve">3. Diseñar un modelo de </w:t>
+            </w:r>
+            <w:proofErr w:type="spellStart"/>
+            <w:r>
+              <w:rPr>
+                <w:rFonts w:ascii="Calibri" w:hAnsi="Calibri" w:cs="Arial"/>
+                <w:i/>
+                <w:color w:val="548DD4"/>
+                <w:sz w:val="20"/>
+                <w:szCs w:val="20"/>
+                <w:lang w:eastAsia="es-CL"/>
+              </w:rPr>
+              <w:t>frameworks</w:t>
+            </w:r>
+            <w:proofErr w:type="spellEnd"/>
+            <w:r>
+              <w:rPr>
+                <w:rFonts w:ascii="Calibri" w:hAnsi="Calibri" w:cs="Arial"/>
+                <w:i/>
+                <w:color w:val="548DD4"/>
+                <w:sz w:val="20"/>
+                <w:szCs w:val="20"/>
+                <w:lang w:eastAsia="es-CL"/>
+              </w:rPr>
+              <w:t xml:space="preserve"> configurable que permita relacionar normas, políticas y funcionalidades sin duplicar la lógica principal del sistema.</w:t>
             </w:r>
             <w:r>
               <w:rPr>
@@ -2315,7 +2563,7 @@
                 <w:lang w:eastAsia="es-CL"/>
               </w:rPr>
               <w:br/>
-              <w:t xml:space="preserve">3. Diseñar la integración de ISO 42001 considerando la arquitectura, datos, </w:t>
+              <w:t xml:space="preserve">4. Implementar en </w:t>
             </w:r>
             <w:proofErr w:type="spellStart"/>
             <w:r>
@@ -2327,7 +2575,7 @@
                 <w:szCs w:val="20"/>
                 <w:lang w:eastAsia="es-CL"/>
               </w:rPr>
-              <w:t>APIs</w:t>
+              <w:t>backend</w:t>
             </w:r>
             <w:proofErr w:type="spellEnd"/>
             <w:r>
@@ -2339,7 +2587,7 @@
                 <w:szCs w:val="20"/>
                 <w:lang w:eastAsia="es-CL"/>
               </w:rPr>
-              <w:t xml:space="preserve">, permisos y estándares técnicos de </w:t>
+              <w:t xml:space="preserve">, base de datos y </w:t>
             </w:r>
             <w:proofErr w:type="spellStart"/>
             <w:r>
@@ -2351,6 +2599,30 @@
                 <w:szCs w:val="20"/>
                 <w:lang w:eastAsia="es-CL"/>
               </w:rPr>
+              <w:t>frontend</w:t>
+            </w:r>
+            <w:proofErr w:type="spellEnd"/>
+            <w:r>
+              <w:rPr>
+                <w:rFonts w:ascii="Calibri" w:hAnsi="Calibri" w:cs="Arial"/>
+                <w:i/>
+                <w:color w:val="548DD4"/>
+                <w:sz w:val="20"/>
+                <w:szCs w:val="20"/>
+                <w:lang w:eastAsia="es-CL"/>
+              </w:rPr>
+              <w:t xml:space="preserve"> la gestión de ISO 42001 y sus 20 políticas, respetando los estándares técnicos de </w:t>
+            </w:r>
+            <w:proofErr w:type="spellStart"/>
+            <w:r>
+              <w:rPr>
+                <w:rFonts w:ascii="Calibri" w:hAnsi="Calibri" w:cs="Arial"/>
+                <w:i/>
+                <w:color w:val="548DD4"/>
+                <w:sz w:val="20"/>
+                <w:szCs w:val="20"/>
+                <w:lang w:eastAsia="es-CL"/>
+              </w:rPr>
               <w:t>Alloxentric</w:t>
             </w:r>
             <w:proofErr w:type="spellEnd"/>
@@ -2375,7 +2647,7 @@
                 <w:lang w:eastAsia="es-CL"/>
               </w:rPr>
               <w:br/>
-              <w:t>4. Desarrollar e integrar las funcionalidades requeridas para ISO 42001 sobre los componentes existentes de la plataforma.</w:t>
+              <w:t>5. Realizar pruebas funcionales, de integración y regresión que verifiquen la gestión de las 20 políticas y la continuidad de las funcionalidades existentes.</w:t>
             </w:r>
             <w:r>
               <w:rPr>
@@ -2387,7 +2659,7 @@
                 <w:lang w:eastAsia="es-CL"/>
               </w:rPr>
               <w:br/>
-              <w:t>5. Realizar pruebas funcionales, de integración y regresión para verificar el funcionamiento de la solución y la continuidad de las funcionalidades asociadas a ISO 27001.</w:t>
+              <w:t>6. Documentar la estructura implementada para facilitar la incorporación futura de nuevas normas o marcos normativos.</w:t>
             </w:r>
           </w:p>
         </w:tc>
@@ -2502,6 +2774,7 @@
                 <w:sz w:val="28"/>
                 <w:szCs w:val="28"/>
               </w:rPr>
+              <w:lastRenderedPageBreak/>
               <w:t>5</w:t>
             </w:r>
             <w:r>
@@ -2671,7 +2944,31 @@
                 <w:szCs w:val="20"/>
                 <w:lang w:eastAsia="es-CL"/>
               </w:rPr>
-              <w:t>El proyecto Dani ISO 42001 se desarrollará utilizando Scrum, organizando el trabajo de manera incremental durante las 18 semanas del periodo académico. El alcance se concentra exclusivamente en integrar la gestión de ISO 42001 en la plataforma DANI27 ya existente, reutilizando y adaptando la solución actualmente utilizada para ISO 27001.</w:t>
+              <w:t xml:space="preserve">El proyecto se desarrollará utilizando Scrum y un enfoque incremental durante las 18 semanas del periodo académico. La implementación no se abordará como veinte desarrollos independientes, sino mediante un esquema de </w:t>
+            </w:r>
+            <w:proofErr w:type="spellStart"/>
+            <w:r>
+              <w:rPr>
+                <w:rFonts w:ascii="Calibri" w:hAnsi="Calibri" w:cs="Arial"/>
+                <w:i/>
+                <w:color w:val="548DD4"/>
+                <w:sz w:val="20"/>
+                <w:szCs w:val="20"/>
+                <w:lang w:eastAsia="es-CL"/>
+              </w:rPr>
+              <w:t>frameworks</w:t>
+            </w:r>
+            <w:proofErr w:type="spellEnd"/>
+            <w:r>
+              <w:rPr>
+                <w:rFonts w:ascii="Calibri" w:hAnsi="Calibri" w:cs="Arial"/>
+                <w:i/>
+                <w:color w:val="548DD4"/>
+                <w:sz w:val="20"/>
+                <w:szCs w:val="20"/>
+                <w:lang w:eastAsia="es-CL"/>
+              </w:rPr>
+              <w:t xml:space="preserve"> reutilizable que permita parametrizar la norma y asociar sus políticas a componentes comunes de DANI27.</w:t>
             </w:r>
             <w:r>
               <w:rPr>
@@ -2694,7 +2991,79 @@
                 <w:lang w:eastAsia="es-CL"/>
               </w:rPr>
               <w:br/>
-              <w:t>Durante la Fase 1 se analizará la arquitectura y los componentes existentes, se levantarán los requerimientos de ISO 42001 y se construirá un backlog priorizado. En la Fase 2 se diseñarán, desarrollarán e integrarán las funcionalidades, distribuyendo responsabilidades técnicas y funcionales entre Vicente Suazo y Andrea Santana. En la Fase 3 se realizarán pruebas de regresión y validación, correcciones, recopilación de evidencias y preparación de la entrega final.</w:t>
+              <w:t xml:space="preserve">En la Fase 1 se analizará la arquitectura actual, el inventario normativo y las 20 políticas de ISO 42001; además, se definirá el modelo de datos, reglas de reutilización y backlog. En la Fase 2 se implementará el </w:t>
+            </w:r>
+            <w:proofErr w:type="spellStart"/>
+            <w:r>
+              <w:rPr>
+                <w:rFonts w:ascii="Calibri" w:hAnsi="Calibri" w:cs="Arial"/>
+                <w:i/>
+                <w:color w:val="548DD4"/>
+                <w:sz w:val="20"/>
+                <w:szCs w:val="20"/>
+                <w:lang w:eastAsia="es-CL"/>
+              </w:rPr>
+              <w:t>framework</w:t>
+            </w:r>
+            <w:proofErr w:type="spellEnd"/>
+            <w:r>
+              <w:rPr>
+                <w:rFonts w:ascii="Calibri" w:hAnsi="Calibri" w:cs="Arial"/>
+                <w:i/>
+                <w:color w:val="548DD4"/>
+                <w:sz w:val="20"/>
+                <w:szCs w:val="20"/>
+                <w:lang w:eastAsia="es-CL"/>
+              </w:rPr>
+              <w:t xml:space="preserve">, se incorporarán progresivamente las 20 políticas y se adaptarán </w:t>
+            </w:r>
+            <w:proofErr w:type="spellStart"/>
+            <w:r>
+              <w:rPr>
+                <w:rFonts w:ascii="Calibri" w:hAnsi="Calibri" w:cs="Arial"/>
+                <w:i/>
+                <w:color w:val="548DD4"/>
+                <w:sz w:val="20"/>
+                <w:szCs w:val="20"/>
+                <w:lang w:eastAsia="es-CL"/>
+              </w:rPr>
+              <w:t>backend</w:t>
+            </w:r>
+            <w:proofErr w:type="spellEnd"/>
+            <w:r>
+              <w:rPr>
+                <w:rFonts w:ascii="Calibri" w:hAnsi="Calibri" w:cs="Arial"/>
+                <w:i/>
+                <w:color w:val="548DD4"/>
+                <w:sz w:val="20"/>
+                <w:szCs w:val="20"/>
+                <w:lang w:eastAsia="es-CL"/>
+              </w:rPr>
+              <w:t xml:space="preserve">, </w:t>
+            </w:r>
+            <w:proofErr w:type="spellStart"/>
+            <w:r>
+              <w:rPr>
+                <w:rFonts w:ascii="Calibri" w:hAnsi="Calibri" w:cs="Arial"/>
+                <w:i/>
+                <w:color w:val="548DD4"/>
+                <w:sz w:val="20"/>
+                <w:szCs w:val="20"/>
+                <w:lang w:eastAsia="es-CL"/>
+              </w:rPr>
+              <w:t>frontend</w:t>
+            </w:r>
+            <w:proofErr w:type="spellEnd"/>
+            <w:r>
+              <w:rPr>
+                <w:rFonts w:ascii="Calibri" w:hAnsi="Calibri" w:cs="Arial"/>
+                <w:i/>
+                <w:color w:val="548DD4"/>
+                <w:sz w:val="20"/>
+                <w:szCs w:val="20"/>
+                <w:lang w:eastAsia="es-CL"/>
+              </w:rPr>
+              <w:t>, permisos y trazabilidad. En la Fase 3 se ejecutarán pruebas funcionales, de integración y regresión, se corregirán hallazgos y se consolidará la documentación.</w:t>
             </w:r>
             <w:r>
               <w:rPr>
@@ -2717,7 +3086,7 @@
                 <w:lang w:eastAsia="es-CL"/>
               </w:rPr>
               <w:br/>
-              <w:t xml:space="preserve">Se efectuarán revisiones semanales para presentar avances, resolver dudas, validar requerimientos y ajustar el backlog. Como criterios transversales se considerarán </w:t>
+              <w:t xml:space="preserve">Se realizarán revisiones semanales con </w:t>
             </w:r>
             <w:proofErr w:type="spellStart"/>
             <w:r>
@@ -2729,6 +3098,30 @@
                 <w:szCs w:val="20"/>
                 <w:lang w:eastAsia="es-CL"/>
               </w:rPr>
+              <w:t>Alloxentric</w:t>
+            </w:r>
+            <w:proofErr w:type="spellEnd"/>
+            <w:r>
+              <w:rPr>
+                <w:rFonts w:ascii="Calibri" w:hAnsi="Calibri" w:cs="Arial"/>
+                <w:i/>
+                <w:color w:val="548DD4"/>
+                <w:sz w:val="20"/>
+                <w:szCs w:val="20"/>
+                <w:lang w:eastAsia="es-CL"/>
+              </w:rPr>
+              <w:t xml:space="preserve"> para validar avances y ajustar el backlog. Como criterios transversales se considerarán </w:t>
+            </w:r>
+            <w:proofErr w:type="spellStart"/>
+            <w:r>
+              <w:rPr>
+                <w:rFonts w:ascii="Calibri" w:hAnsi="Calibri" w:cs="Arial"/>
+                <w:i/>
+                <w:color w:val="548DD4"/>
+                <w:sz w:val="20"/>
+                <w:szCs w:val="20"/>
+                <w:lang w:eastAsia="es-CL"/>
+              </w:rPr>
               <w:t>multi-tenancy</w:t>
             </w:r>
             <w:proofErr w:type="spellEnd"/>
@@ -2813,7 +3206,7 @@
                 <w:szCs w:val="20"/>
                 <w:lang w:eastAsia="es-CL"/>
               </w:rPr>
-              <w:t>, RBAC y JWT, internacionalización, arquitectura API-First y auditoría de logs, según corresponda al alcance de cada funcionalidad.</w:t>
+              <w:t>, RBAC/JWT, internacionalización, arquitectura API-First y auditoría de logs.</w:t>
             </w:r>
           </w:p>
         </w:tc>
@@ -3147,18 +3540,7 @@
                 <w:szCs w:val="20"/>
                 <w:lang w:eastAsia="es-CL"/>
               </w:rPr>
-              <w:t>A</w:t>
-            </w:r>
-            <w:r>
-              <w:rPr>
-                <w:rFonts w:ascii="Calibri" w:hAnsi="Calibri" w:cs="Arial"/>
-                <w:i/>
-                <w:color w:val="548DD4"/>
-                <w:sz w:val="20"/>
-                <w:szCs w:val="20"/>
-                <w:lang w:eastAsia="es-CL"/>
-              </w:rPr>
-              <w:t>vance</w:t>
+              <w:t>Avance</w:t>
             </w:r>
           </w:p>
         </w:tc>
@@ -3188,7 +3570,7 @@
                 <w:szCs w:val="20"/>
                 <w:lang w:eastAsia="es-CL"/>
               </w:rPr>
-              <w:t>Análisis técnico y requerimientos ISO 42001</w:t>
+              <w:t>Matriz de alcance ISO 42001</w:t>
             </w:r>
           </w:p>
         </w:tc>
@@ -3218,7 +3600,7 @@
                 <w:szCs w:val="20"/>
                 <w:lang w:eastAsia="es-CL"/>
               </w:rPr>
-              <w:t>Análisis de la plataforma ISO 27001, componentes reutilizables, requerimientos de ISO 42001 y backlog inicial. Incluye evidencias diferenciadas del análisis técnico de Vicente y del levantamiento funcional de Andrea.</w:t>
+              <w:t>Inventario y clasificación de las 20 políticas de ISO 42001, indicando su relación con componentes existentes y necesidades de implementación.</w:t>
             </w:r>
           </w:p>
         </w:tc>
@@ -3248,7 +3630,7 @@
                 <w:szCs w:val="20"/>
                 <w:lang w:eastAsia="es-CL"/>
               </w:rPr>
-              <w:t>Demuestra comprensión del sistema existente, definición del alcance y participación individual del equipo.</w:t>
+              <w:t>Demuestra que el alcance normativo fue identificado y convertido en requerimientos implementables.</w:t>
             </w:r>
           </w:p>
         </w:tc>
@@ -3313,7 +3695,31 @@
                 <w:szCs w:val="20"/>
                 <w:lang w:eastAsia="es-CL"/>
               </w:rPr>
-              <w:t>Diseño técnico y funcional de integración</w:t>
+              <w:t xml:space="preserve">Diseño del </w:t>
+            </w:r>
+            <w:proofErr w:type="spellStart"/>
+            <w:r>
+              <w:rPr>
+                <w:rFonts w:ascii="Calibri" w:hAnsi="Calibri" w:cs="Arial"/>
+                <w:i/>
+                <w:color w:val="548DD4"/>
+                <w:sz w:val="20"/>
+                <w:szCs w:val="20"/>
+                <w:lang w:eastAsia="es-CL"/>
+              </w:rPr>
+              <w:t>framework</w:t>
+            </w:r>
+            <w:proofErr w:type="spellEnd"/>
+            <w:r>
+              <w:rPr>
+                <w:rFonts w:ascii="Calibri" w:hAnsi="Calibri" w:cs="Arial"/>
+                <w:i/>
+                <w:color w:val="548DD4"/>
+                <w:sz w:val="20"/>
+                <w:szCs w:val="20"/>
+                <w:lang w:eastAsia="es-CL"/>
+              </w:rPr>
+              <w:t xml:space="preserve"> normativo</w:t>
             </w:r>
           </w:p>
         </w:tc>
@@ -3343,7 +3749,7 @@
                 <w:szCs w:val="20"/>
                 <w:lang w:eastAsia="es-CL"/>
               </w:rPr>
-              <w:t xml:space="preserve">Diseño de componentes, flujos, </w:t>
+              <w:t xml:space="preserve">Modelo de datos, componentes, </w:t>
             </w:r>
             <w:proofErr w:type="spellStart"/>
             <w:r>
@@ -3367,7 +3773,7 @@
                 <w:szCs w:val="20"/>
                 <w:lang w:eastAsia="es-CL"/>
               </w:rPr>
-              <w:t>, datos, permisos, interfaces y criterios de aceptación necesarios para integrar ISO 42001.</w:t>
+              <w:t>, flujos y reglas para gestionar ISO 42001 sin acoplar la plataforma a una única norma.</w:t>
             </w:r>
           </w:p>
         </w:tc>
@@ -3397,7 +3803,7 @@
                 <w:szCs w:val="20"/>
                 <w:lang w:eastAsia="es-CL"/>
               </w:rPr>
-              <w:t>Demuestra cómo se planificó la ampliación respetando la arquitectura existente y separando responsabilidades técnicas y funcionales.</w:t>
+              <w:t>Demuestra la reutilización y escalabilidad de la solución para futuros marcos.</w:t>
             </w:r>
           </w:p>
         </w:tc>
@@ -3432,7 +3838,6 @@
                 <w:szCs w:val="20"/>
                 <w:lang w:eastAsia="es-CL"/>
               </w:rPr>
-              <w:lastRenderedPageBreak/>
               <w:t>Final</w:t>
             </w:r>
           </w:p>
@@ -3463,7 +3868,7 @@
                 <w:szCs w:val="20"/>
                 <w:lang w:eastAsia="es-CL"/>
               </w:rPr>
-              <w:t>Funcionalidad ISO 42001 integrada</w:t>
+              <w:t>20 políticas ISO 42001 integradas</w:t>
             </w:r>
           </w:p>
         </w:tc>
@@ -3493,7 +3898,31 @@
                 <w:szCs w:val="20"/>
                 <w:lang w:eastAsia="es-CL"/>
               </w:rPr>
-              <w:t>Demostración de las funcionalidades desarrolladas por ambos integrantes e integradas dentro de DANI27, manteniendo la gestión existente de ISO 27001.</w:t>
+              <w:t xml:space="preserve">Demostración de la gestión de las 20 políticas priorizadas dentro de DANI27 mediante el nuevo esquema de </w:t>
+            </w:r>
+            <w:proofErr w:type="spellStart"/>
+            <w:r>
+              <w:rPr>
+                <w:rFonts w:ascii="Calibri" w:hAnsi="Calibri" w:cs="Arial"/>
+                <w:i/>
+                <w:color w:val="548DD4"/>
+                <w:sz w:val="20"/>
+                <w:szCs w:val="20"/>
+                <w:lang w:eastAsia="es-CL"/>
+              </w:rPr>
+              <w:t>frameworks</w:t>
+            </w:r>
+            <w:proofErr w:type="spellEnd"/>
+            <w:r>
+              <w:rPr>
+                <w:rFonts w:ascii="Calibri" w:hAnsi="Calibri" w:cs="Arial"/>
+                <w:i/>
+                <w:color w:val="548DD4"/>
+                <w:sz w:val="20"/>
+                <w:szCs w:val="20"/>
+                <w:lang w:eastAsia="es-CL"/>
+              </w:rPr>
+              <w:t>.</w:t>
             </w:r>
           </w:p>
         </w:tc>
@@ -3523,7 +3952,7 @@
                 <w:szCs w:val="20"/>
                 <w:lang w:eastAsia="es-CL"/>
               </w:rPr>
-              <w:t>Constituye la principal evidencia funcional del cumplimiento del objetivo general.</w:t>
+              <w:t>Constituye la evidencia principal del cumplimiento del requerimiento funcional.</w:t>
             </w:r>
           </w:p>
         </w:tc>
@@ -3558,6 +3987,7 @@
                 <w:szCs w:val="20"/>
                 <w:lang w:eastAsia="es-CL"/>
               </w:rPr>
+              <w:lastRenderedPageBreak/>
               <w:t>Final</w:t>
             </w:r>
           </w:p>
@@ -3588,7 +4018,7 @@
                 <w:szCs w:val="20"/>
                 <w:lang w:eastAsia="es-CL"/>
               </w:rPr>
-              <w:t>Pruebas, validación y evidencias</w:t>
+              <w:t>Pruebas y documentación técnica</w:t>
             </w:r>
           </w:p>
         </w:tc>
@@ -3618,7 +4048,31 @@
                 <w:szCs w:val="20"/>
                 <w:lang w:eastAsia="es-CL"/>
               </w:rPr>
-              <w:t>Registro de pruebas funcionales, de integración y regresión, resultados, correcciones realizadas y evidencias individuales de cada integrante.</w:t>
+              <w:t xml:space="preserve">Casos de prueba, resultados, correcciones y documentación de la estructura necesaria para incorporar nuevos </w:t>
+            </w:r>
+            <w:proofErr w:type="spellStart"/>
+            <w:r>
+              <w:rPr>
+                <w:rFonts w:ascii="Calibri" w:hAnsi="Calibri" w:cs="Arial"/>
+                <w:i/>
+                <w:color w:val="548DD4"/>
+                <w:sz w:val="20"/>
+                <w:szCs w:val="20"/>
+                <w:lang w:eastAsia="es-CL"/>
+              </w:rPr>
+              <w:t>frameworks</w:t>
+            </w:r>
+            <w:proofErr w:type="spellEnd"/>
+            <w:r>
+              <w:rPr>
+                <w:rFonts w:ascii="Calibri" w:hAnsi="Calibri" w:cs="Arial"/>
+                <w:i/>
+                <w:color w:val="548DD4"/>
+                <w:sz w:val="20"/>
+                <w:szCs w:val="20"/>
+                <w:lang w:eastAsia="es-CL"/>
+              </w:rPr>
+              <w:t>.</w:t>
             </w:r>
           </w:p>
         </w:tc>
@@ -3648,7 +4102,7 @@
                 <w:szCs w:val="20"/>
                 <w:lang w:eastAsia="es-CL"/>
               </w:rPr>
-              <w:t>Permite verificar el funcionamiento de la solución, la integración y la trazabilidad de los aportes del equipo.</w:t>
+              <w:t>Verifica funcionamiento, regresión, trazabilidad y mantenibilidad de la solución.</w:t>
             </w:r>
           </w:p>
         </w:tc>
@@ -3762,23 +4216,7 @@
                 <w:rFonts w:ascii="Calibri" w:hAnsi="Calibri"/>
                 <w:color w:val="1F3864" w:themeColor="accent1" w:themeShade="80"/>
               </w:rPr>
-              <w:t xml:space="preserve">efine la planificación de tu Proyecto APT </w:t>
-            </w:r>
-            <w:proofErr w:type="gramStart"/>
-            <w:r>
-              <w:rPr>
-                <w:rFonts w:ascii="Calibri" w:hAnsi="Calibri"/>
-                <w:color w:val="1F3864" w:themeColor="accent1" w:themeShade="80"/>
-              </w:rPr>
-              <w:t>de acuerdo a</w:t>
-            </w:r>
-            <w:proofErr w:type="gramEnd"/>
-            <w:r>
-              <w:rPr>
-                <w:rFonts w:ascii="Calibri" w:hAnsi="Calibri"/>
-                <w:color w:val="1F3864" w:themeColor="accent1" w:themeShade="80"/>
-              </w:rPr>
-              <w:t xml:space="preserve"> lo requerido</w:t>
+              <w:t>efine la planificación de tu Proyecto APT de acuerdo a lo requerido</w:t>
             </w:r>
             <w:r>
               <w:rPr>
@@ -3833,6 +4271,44 @@
         </w:trPr>
         <w:tc>
           <w:tcPr>
+            <w:tcW w:w="11061" w:type="dxa"/>
+            <w:gridSpan w:val="7"/>
+            <w:tcBorders>
+              <w:top w:val="single" w:sz="4" w:space="0" w:color="BFBFBF" w:themeColor="background1" w:themeShade="BF"/>
+              <w:left w:val="single" w:sz="4" w:space="0" w:color="BFBFBF" w:themeColor="background1" w:themeShade="BF"/>
+              <w:bottom w:val="single" w:sz="4" w:space="0" w:color="BFBFBF" w:themeColor="background1" w:themeShade="BF"/>
+              <w:right w:val="single" w:sz="4" w:space="0" w:color="BFBFBF" w:themeColor="background1" w:themeShade="BF"/>
+            </w:tcBorders>
+            <w:shd w:val="clear" w:color="auto" w:fill="1F4E78"/>
+            <w:hideMark/>
+          </w:tcPr>
+          <w:p>
+            <w:pPr>
+              <w:spacing w:after="0" w:line="360" w:lineRule="auto"/>
+              <w:jc w:val="both"/>
+              <w:rPr>
+                <w:b/>
+                <w:sz w:val="24"/>
+                <w:szCs w:val="24"/>
+              </w:rPr>
+            </w:pPr>
+            <w:r>
+              <w:rPr>
+                <w:b/>
+                <w:sz w:val="24"/>
+                <w:szCs w:val="24"/>
+              </w:rPr>
+              <w:t>Plan de Trabajo Proyecto APT</w:t>
+            </w:r>
+          </w:p>
+        </w:tc>
+      </w:tr>
+      <w:tr>
+        <w:trPr>
+          <w:jc w:val="center"/>
+        </w:trPr>
+        <w:tc>
+          <w:tcPr>
             <w:tcW w:w="1580" w:type="dxa"/>
             <w:tcBorders>
               <w:top w:val="single" w:sz="4" w:space="0" w:color="BFBFBF" w:themeColor="background1" w:themeShade="BF"/>
@@ -3845,24 +4321,19 @@
           </w:tcPr>
           <w:p>
             <w:pPr>
-              <w:jc w:val="both"/>
-              <w:rPr>
-                <w:rFonts w:ascii="Calibri" w:hAnsi="Calibri" w:cs="Arial"/>
-                <w:i/>
-                <w:color w:val="548DD4"/>
-                <w:sz w:val="20"/>
-                <w:szCs w:val="20"/>
-                <w:lang w:eastAsia="es-CL"/>
-              </w:rPr>
-            </w:pPr>
-            <w:r>
-              <w:rPr>
-                <w:rFonts w:ascii="Calibri" w:hAnsi="Calibri" w:cs="Arial"/>
-                <w:i/>
-                <w:color w:val="548DD4"/>
-                <w:sz w:val="20"/>
-                <w:szCs w:val="20"/>
-                <w:lang w:eastAsia="es-CL"/>
+              <w:spacing w:after="0" w:line="360" w:lineRule="auto"/>
+              <w:jc w:val="both"/>
+              <w:rPr>
+                <w:b/>
+                <w:sz w:val="24"/>
+                <w:szCs w:val="24"/>
+              </w:rPr>
+            </w:pPr>
+            <w:r>
+              <w:rPr>
+                <w:b/>
+                <w:sz w:val="24"/>
+                <w:szCs w:val="24"/>
               </w:rPr>
               <w:t>Competencia o unidades de competencias</w:t>
             </w:r>
@@ -3883,50 +4354,21 @@
           </w:tcPr>
           <w:p>
             <w:pPr>
-              <w:jc w:val="both"/>
-              <w:rPr>
-                <w:rFonts w:ascii="Calibri" w:hAnsi="Calibri" w:cs="Arial"/>
-                <w:i/>
-                <w:color w:val="548DD4"/>
-                <w:sz w:val="20"/>
-                <w:szCs w:val="20"/>
-                <w:lang w:eastAsia="es-CL"/>
-              </w:rPr>
-            </w:pPr>
-            <w:r>
-              <w:rPr>
-                <w:rFonts w:ascii="Calibri" w:hAnsi="Calibri" w:cs="Arial"/>
-                <w:i/>
-                <w:color w:val="548DD4"/>
-                <w:sz w:val="20"/>
-                <w:szCs w:val="20"/>
-                <w:lang w:eastAsia="es-CL"/>
-              </w:rPr>
-              <w:t xml:space="preserve">Nombre </w:t>
-            </w:r>
-            <w:proofErr w:type="gramStart"/>
-            <w:r>
-              <w:rPr>
-                <w:rFonts w:ascii="Calibri" w:hAnsi="Calibri" w:cs="Arial"/>
-                <w:i/>
-                <w:color w:val="548DD4"/>
-                <w:sz w:val="20"/>
-                <w:szCs w:val="20"/>
-                <w:lang w:eastAsia="es-CL"/>
-              </w:rPr>
-              <w:t>de  Actividades</w:t>
-            </w:r>
-            <w:proofErr w:type="gramEnd"/>
-            <w:r>
-              <w:rPr>
-                <w:rFonts w:ascii="Calibri" w:hAnsi="Calibri" w:cs="Arial"/>
-                <w:i/>
-                <w:color w:val="548DD4"/>
-                <w:sz w:val="20"/>
-                <w:szCs w:val="20"/>
-                <w:lang w:eastAsia="es-CL"/>
-              </w:rPr>
-              <w:t>/Tareas</w:t>
+              <w:spacing w:after="0" w:line="360" w:lineRule="auto"/>
+              <w:jc w:val="both"/>
+              <w:rPr>
+                <w:b/>
+                <w:sz w:val="24"/>
+                <w:szCs w:val="24"/>
+              </w:rPr>
+            </w:pPr>
+            <w:r>
+              <w:rPr>
+                <w:b/>
+                <w:sz w:val="24"/>
+                <w:szCs w:val="24"/>
+              </w:rPr>
+              <w:t>Nombre de  Actividades/Tareas</w:t>
             </w:r>
           </w:p>
         </w:tc>
@@ -3945,24 +4387,19 @@
           </w:tcPr>
           <w:p>
             <w:pPr>
-              <w:jc w:val="both"/>
-              <w:rPr>
-                <w:rFonts w:ascii="Calibri" w:hAnsi="Calibri" w:cs="Arial"/>
-                <w:i/>
-                <w:color w:val="548DD4"/>
-                <w:sz w:val="20"/>
-                <w:szCs w:val="20"/>
-                <w:lang w:eastAsia="es-CL"/>
-              </w:rPr>
-            </w:pPr>
-            <w:r>
-              <w:rPr>
-                <w:rFonts w:ascii="Calibri" w:hAnsi="Calibri" w:cs="Arial"/>
-                <w:i/>
-                <w:color w:val="548DD4"/>
-                <w:sz w:val="20"/>
-                <w:szCs w:val="20"/>
-                <w:lang w:eastAsia="es-CL"/>
+              <w:spacing w:after="0" w:line="360" w:lineRule="auto"/>
+              <w:jc w:val="both"/>
+              <w:rPr>
+                <w:b/>
+                <w:sz w:val="24"/>
+                <w:szCs w:val="24"/>
+              </w:rPr>
+            </w:pPr>
+            <w:r>
+              <w:rPr>
+                <w:b/>
+                <w:sz w:val="24"/>
+                <w:szCs w:val="24"/>
               </w:rPr>
               <w:t>Descripción Actividades/Tareas</w:t>
             </w:r>
@@ -3983,24 +4420,19 @@
           </w:tcPr>
           <w:p>
             <w:pPr>
-              <w:jc w:val="both"/>
-              <w:rPr>
-                <w:rFonts w:ascii="Calibri" w:hAnsi="Calibri" w:cs="Arial"/>
-                <w:i/>
-                <w:color w:val="548DD4"/>
-                <w:sz w:val="20"/>
-                <w:szCs w:val="20"/>
-                <w:lang w:eastAsia="es-CL"/>
-              </w:rPr>
-            </w:pPr>
-            <w:r>
-              <w:rPr>
-                <w:rFonts w:ascii="Calibri" w:hAnsi="Calibri" w:cs="Arial"/>
-                <w:i/>
-                <w:color w:val="548DD4"/>
-                <w:sz w:val="20"/>
-                <w:szCs w:val="20"/>
-                <w:lang w:eastAsia="es-CL"/>
+              <w:spacing w:after="0" w:line="360" w:lineRule="auto"/>
+              <w:jc w:val="both"/>
+              <w:rPr>
+                <w:b/>
+                <w:sz w:val="24"/>
+                <w:szCs w:val="24"/>
+              </w:rPr>
+            </w:pPr>
+            <w:r>
+              <w:rPr>
+                <w:b/>
+                <w:sz w:val="24"/>
+                <w:szCs w:val="24"/>
               </w:rPr>
               <w:t>Recursos</w:t>
             </w:r>
@@ -4020,38 +4452,31 @@
           </w:tcPr>
           <w:p>
             <w:pPr>
-              <w:jc w:val="both"/>
-              <w:rPr>
-                <w:rFonts w:ascii="Calibri" w:hAnsi="Calibri" w:cs="Arial"/>
-                <w:i/>
-                <w:color w:val="548DD4"/>
-                <w:sz w:val="20"/>
-                <w:szCs w:val="20"/>
-                <w:lang w:eastAsia="es-CL"/>
-              </w:rPr>
-            </w:pPr>
-            <w:r>
-              <w:rPr>
-                <w:rFonts w:ascii="Calibri" w:hAnsi="Calibri" w:cs="Arial"/>
-                <w:i/>
-                <w:color w:val="548DD4"/>
-                <w:sz w:val="20"/>
-                <w:szCs w:val="20"/>
-                <w:lang w:eastAsia="es-CL"/>
+              <w:spacing w:after="0" w:line="360" w:lineRule="auto"/>
+              <w:jc w:val="both"/>
+              <w:rPr>
+                <w:b/>
+                <w:sz w:val="24"/>
+                <w:szCs w:val="24"/>
+              </w:rPr>
+            </w:pPr>
+            <w:r>
+              <w:rPr>
+                <w:b/>
+                <w:sz w:val="24"/>
+                <w:szCs w:val="24"/>
               </w:rPr>
               <w:t>Duración de la actividad</w:t>
             </w:r>
           </w:p>
           <w:p>
             <w:pPr>
-              <w:jc w:val="both"/>
-              <w:rPr>
-                <w:rFonts w:ascii="Calibri" w:hAnsi="Calibri" w:cs="Arial"/>
-                <w:i/>
-                <w:color w:val="548DD4"/>
-                <w:sz w:val="20"/>
-                <w:szCs w:val="20"/>
-                <w:lang w:eastAsia="es-CL"/>
+              <w:spacing w:after="0" w:line="360" w:lineRule="auto"/>
+              <w:jc w:val="both"/>
+              <w:rPr>
+                <w:b/>
+                <w:sz w:val="24"/>
+                <w:szCs w:val="24"/>
               </w:rPr>
             </w:pPr>
           </w:p>
@@ -4071,35 +4496,28 @@
           </w:tcPr>
           <w:p>
             <w:pPr>
-              <w:jc w:val="both"/>
-              <w:rPr>
-                <w:rFonts w:ascii="Calibri" w:hAnsi="Calibri" w:cs="Arial"/>
-                <w:i/>
-                <w:color w:val="548DD4"/>
-                <w:sz w:val="20"/>
-                <w:szCs w:val="20"/>
-                <w:lang w:eastAsia="es-CL"/>
-              </w:rPr>
-            </w:pPr>
-            <w:r>
-              <w:rPr>
-                <w:rFonts w:ascii="Calibri" w:hAnsi="Calibri" w:cs="Arial"/>
-                <w:i/>
-                <w:color w:val="548DD4"/>
-                <w:sz w:val="20"/>
-                <w:szCs w:val="20"/>
-                <w:lang w:eastAsia="es-CL"/>
+              <w:spacing w:after="0" w:line="360" w:lineRule="auto"/>
+              <w:jc w:val="both"/>
+              <w:rPr>
+                <w:b/>
+                <w:sz w:val="24"/>
+                <w:szCs w:val="24"/>
+              </w:rPr>
+            </w:pPr>
+            <w:r>
+              <w:rPr>
+                <w:b/>
+                <w:sz w:val="24"/>
+                <w:szCs w:val="24"/>
               </w:rPr>
               <w:t>Responsable</w:t>
             </w:r>
             <w:r>
               <w:rPr>
-                <w:rFonts w:ascii="Calibri" w:hAnsi="Calibri" w:cs="Arial"/>
-                <w:i/>
-                <w:color w:val="548DD4"/>
-                <w:sz w:val="20"/>
-                <w:szCs w:val="20"/>
-                <w:lang w:eastAsia="es-CL"/>
+                <w:b/>
+                <w:sz w:val="24"/>
+                <w:szCs w:val="24"/>
+                <w:vertAlign w:val="superscript"/>
               </w:rPr>
               <w:footnoteReference w:id="1"/>
             </w:r>
@@ -4120,24 +4538,19 @@
           </w:tcPr>
           <w:p>
             <w:pPr>
-              <w:jc w:val="both"/>
-              <w:rPr>
-                <w:rFonts w:ascii="Calibri" w:hAnsi="Calibri" w:cs="Arial"/>
-                <w:i/>
-                <w:color w:val="548DD4"/>
-                <w:sz w:val="20"/>
-                <w:szCs w:val="20"/>
-                <w:lang w:eastAsia="es-CL"/>
-              </w:rPr>
-            </w:pPr>
-            <w:r>
-              <w:rPr>
-                <w:rFonts w:ascii="Calibri" w:hAnsi="Calibri" w:cs="Arial"/>
-                <w:i/>
-                <w:color w:val="548DD4"/>
-                <w:sz w:val="20"/>
-                <w:szCs w:val="20"/>
-                <w:lang w:eastAsia="es-CL"/>
+              <w:spacing w:after="0" w:line="360" w:lineRule="auto"/>
+              <w:jc w:val="both"/>
+              <w:rPr>
+                <w:b/>
+                <w:sz w:val="24"/>
+                <w:szCs w:val="24"/>
+              </w:rPr>
+            </w:pPr>
+            <w:r>
+              <w:rPr>
+                <w:b/>
+                <w:sz w:val="24"/>
+                <w:szCs w:val="24"/>
               </w:rPr>
               <w:t>Observaciones</w:t>
             </w:r>
@@ -4181,7 +4594,7 @@
                 <w:szCs w:val="20"/>
                 <w:lang w:eastAsia="es-CL"/>
               </w:rPr>
-              <w:t>Análisis y Planificación de Requerimientos / Arquitectura de Software</w:t>
+              <w:t>Análisis de Requerimientos / Arquitectura</w:t>
             </w:r>
           </w:p>
         </w:tc>
@@ -4255,7 +4668,7 @@
                 <w:szCs w:val="20"/>
                 <w:lang w:eastAsia="es-CL"/>
               </w:rPr>
-              <w:t xml:space="preserve">Revisar arquitectura, módulos, </w:t>
+              <w:t xml:space="preserve">Revisar módulos, datos, </w:t>
             </w:r>
             <w:proofErr w:type="spellStart"/>
             <w:r>
@@ -4279,7 +4692,7 @@
                 <w:szCs w:val="20"/>
                 <w:lang w:eastAsia="es-CL"/>
               </w:rPr>
-              <w:t>, datos y componentes de ISO 27001 reutilizables para la integración de ISO 42001.</w:t>
+              <w:t xml:space="preserve"> y lógica actual para detectar dependencias de ISO 27001 y oportunidades de reutilización.</w:t>
             </w:r>
           </w:p>
         </w:tc>
@@ -4316,31 +4729,7 @@
                 <w:szCs w:val="20"/>
                 <w:lang w:eastAsia="es-CL"/>
               </w:rPr>
-              <w:t xml:space="preserve">Repositorio </w:t>
-            </w:r>
-            <w:proofErr w:type="spellStart"/>
-            <w:r>
-              <w:rPr>
-                <w:rFonts w:ascii="Calibri" w:hAnsi="Calibri" w:cs="Arial"/>
-                <w:i/>
-                <w:color w:val="548DD4"/>
-                <w:sz w:val="20"/>
-                <w:szCs w:val="20"/>
-                <w:lang w:eastAsia="es-CL"/>
-              </w:rPr>
-              <w:t>eth-sgsi</w:t>
-            </w:r>
-            <w:proofErr w:type="spellEnd"/>
-            <w:r>
-              <w:rPr>
-                <w:rFonts w:ascii="Calibri" w:hAnsi="Calibri" w:cs="Arial"/>
-                <w:i/>
-                <w:color w:val="548DD4"/>
-                <w:sz w:val="20"/>
-                <w:szCs w:val="20"/>
-                <w:lang w:eastAsia="es-CL"/>
-              </w:rPr>
-              <w:t>, documentación, entorno local, Git/GitHub.</w:t>
+              <w:t>Repositorio, README, entorno local, Git/GitHub.</w:t>
             </w:r>
           </w:p>
         </w:tc>
@@ -4451,7 +4840,31 @@
                 <w:szCs w:val="20"/>
                 <w:lang w:eastAsia="es-CL"/>
               </w:rPr>
-              <w:t>Base técnica de la integración.</w:t>
+              <w:t xml:space="preserve">Base técnica del esquema de </w:t>
+            </w:r>
+            <w:proofErr w:type="spellStart"/>
+            <w:r>
+              <w:rPr>
+                <w:rFonts w:ascii="Calibri" w:hAnsi="Calibri" w:cs="Arial"/>
+                <w:i/>
+                <w:color w:val="548DD4"/>
+                <w:sz w:val="20"/>
+                <w:szCs w:val="20"/>
+                <w:lang w:eastAsia="es-CL"/>
+              </w:rPr>
+              <w:t>frameworks</w:t>
+            </w:r>
+            <w:proofErr w:type="spellEnd"/>
+            <w:r>
+              <w:rPr>
+                <w:rFonts w:ascii="Calibri" w:hAnsi="Calibri" w:cs="Arial"/>
+                <w:i/>
+                <w:color w:val="548DD4"/>
+                <w:sz w:val="20"/>
+                <w:szCs w:val="20"/>
+                <w:lang w:eastAsia="es-CL"/>
+              </w:rPr>
+              <w:t>.</w:t>
             </w:r>
           </w:p>
         </w:tc>
@@ -4493,7 +4906,7 @@
                 <w:szCs w:val="20"/>
                 <w:lang w:eastAsia="es-CL"/>
               </w:rPr>
-              <w:t>Análisis y Planificación de Requerimientos</w:t>
+              <w:t>Análisis de Requerimientos / Cumplimiento</w:t>
             </w:r>
           </w:p>
         </w:tc>
@@ -4530,7 +4943,7 @@
                 <w:szCs w:val="20"/>
                 <w:lang w:eastAsia="es-CL"/>
               </w:rPr>
-              <w:t>Levantamiento funcional ISO 42001</w:t>
+              <w:t>Análisis de las 20 políticas ISO 42001</w:t>
             </w:r>
           </w:p>
         </w:tc>
@@ -4567,7 +4980,7 @@
                 <w:szCs w:val="20"/>
                 <w:lang w:eastAsia="es-CL"/>
               </w:rPr>
-              <w:t>Identificar requerimientos, flujos de gestión y necesidades funcionales de ISO 42001 que deberán incorporarse a la plataforma.</w:t>
+              <w:t>Clasificar y documentar las 20 políticas del inventario, identificando datos, flujos y criterios funcionales requeridos.</w:t>
             </w:r>
           </w:p>
         </w:tc>
@@ -4604,7 +5017,7 @@
                 <w:szCs w:val="20"/>
                 <w:lang w:eastAsia="es-CL"/>
               </w:rPr>
-              <w:t>ISO 42001, documentación del proyecto, reuniones semanales.</w:t>
+              <w:t>Inventario normativo, ISO 42001, reuniones.</w:t>
             </w:r>
           </w:p>
         </w:tc>
@@ -4641,7 +5054,7 @@
                 <w:szCs w:val="20"/>
                 <w:lang w:eastAsia="es-CL"/>
               </w:rPr>
-              <w:t>S1-S4</w:t>
+              <w:t>S1-S3</w:t>
             </w:r>
           </w:p>
         </w:tc>
@@ -4715,7 +5128,7 @@
                 <w:szCs w:val="20"/>
                 <w:lang w:eastAsia="es-CL"/>
               </w:rPr>
-              <w:t>Define necesidades funcionales y alcance.</w:t>
+              <w:t>Define el alcance funcional priorizado.</w:t>
             </w:r>
           </w:p>
         </w:tc>
@@ -4757,7 +5170,7 @@
                 <w:szCs w:val="20"/>
                 <w:lang w:eastAsia="es-CL"/>
               </w:rPr>
-              <w:t>Arquitectura de Software / Modelos de Datos</w:t>
+              <w:t>Arquitectura / Modelos de Datos</w:t>
             </w:r>
           </w:p>
         </w:tc>
@@ -4794,7 +5207,31 @@
                 <w:szCs w:val="20"/>
                 <w:lang w:eastAsia="es-CL"/>
               </w:rPr>
-              <w:t>Diseño técnico de integración</w:t>
+              <w:t xml:space="preserve">Diseño del </w:t>
+            </w:r>
+            <w:proofErr w:type="spellStart"/>
+            <w:r>
+              <w:rPr>
+                <w:rFonts w:ascii="Calibri" w:hAnsi="Calibri" w:cs="Arial"/>
+                <w:i/>
+                <w:color w:val="548DD4"/>
+                <w:sz w:val="20"/>
+                <w:szCs w:val="20"/>
+                <w:lang w:eastAsia="es-CL"/>
+              </w:rPr>
+              <w:t>framework</w:t>
+            </w:r>
+            <w:proofErr w:type="spellEnd"/>
+            <w:r>
+              <w:rPr>
+                <w:rFonts w:ascii="Calibri" w:hAnsi="Calibri" w:cs="Arial"/>
+                <w:i/>
+                <w:color w:val="548DD4"/>
+                <w:sz w:val="20"/>
+                <w:szCs w:val="20"/>
+                <w:lang w:eastAsia="es-CL"/>
+              </w:rPr>
+              <w:t xml:space="preserve"> normativo</w:t>
             </w:r>
           </w:p>
         </w:tc>
@@ -4831,7 +5268,7 @@
                 <w:szCs w:val="20"/>
                 <w:lang w:eastAsia="es-CL"/>
               </w:rPr>
-              <w:t xml:space="preserve">Definir componentes, </w:t>
+              <w:t xml:space="preserve">Diseñar entidades y relaciones para </w:t>
             </w:r>
             <w:proofErr w:type="spellStart"/>
             <w:r>
@@ -4843,7 +5280,7 @@
                 <w:szCs w:val="20"/>
                 <w:lang w:eastAsia="es-CL"/>
               </w:rPr>
-              <w:t>APIs</w:t>
+              <w:t>frameworks</w:t>
             </w:r>
             <w:proofErr w:type="spellEnd"/>
             <w:r>
@@ -4855,7 +5292,7 @@
                 <w:szCs w:val="20"/>
                 <w:lang w:eastAsia="es-CL"/>
               </w:rPr>
-              <w:t xml:space="preserve">, modelo de datos, permisos y puntos de </w:t>
+              <w:t xml:space="preserve">, políticas y asociación con </w:t>
             </w:r>
             <w:r>
               <w:rPr>
@@ -4867,7 +5304,7 @@
                 <w:lang w:eastAsia="es-CL"/>
               </w:rPr>
               <w:lastRenderedPageBreak/>
-              <w:t>integración con la arquitectura existente.</w:t>
+              <w:t>componentes comunes.</w:t>
             </w:r>
           </w:p>
         </w:tc>
@@ -4918,7 +5355,7 @@
                 <w:szCs w:val="20"/>
                 <w:lang w:eastAsia="es-CL"/>
               </w:rPr>
-              <w:t>, PostgreSQL, documentación técnica, diagramas.</w:t>
+              <w:t>, PostgreSQL, diagramas.</w:t>
             </w:r>
           </w:p>
         </w:tc>
@@ -5029,7 +5466,7 @@
                 <w:szCs w:val="20"/>
                 <w:lang w:eastAsia="es-CL"/>
               </w:rPr>
-              <w:t>Diseño previo al desarrollo.</w:t>
+              <w:t>Evita lógica rígida por norma.</w:t>
             </w:r>
           </w:p>
         </w:tc>
@@ -5071,7 +5508,7 @@
                 <w:szCs w:val="20"/>
                 <w:lang w:eastAsia="es-CL"/>
               </w:rPr>
-              <w:t>Gestión de Proyectos / Calidad de Software</w:t>
+              <w:t>Gestión de Proyecto / Calidad</w:t>
             </w:r>
           </w:p>
         </w:tc>
@@ -5145,7 +5582,7 @@
                 <w:szCs w:val="20"/>
                 <w:lang w:eastAsia="es-CL"/>
               </w:rPr>
-              <w:t>Transformar los requerimientos en historias o tareas priorizadas, definiendo criterios de aceptación y trazabilidad.</w:t>
+              <w:t>Convertir las 20 políticas en historias/tareas, criterios de aceptación y lotes de implementación.</w:t>
             </w:r>
           </w:p>
         </w:tc>
@@ -5182,7 +5619,7 @@
                 <w:szCs w:val="20"/>
                 <w:lang w:eastAsia="es-CL"/>
               </w:rPr>
-              <w:t>Backlog, reuniones Scrum, documentación funcional.</w:t>
+              <w:t>Backlog Scrum, matriz de políticas.</w:t>
             </w:r>
           </w:p>
         </w:tc>
@@ -5293,7 +5730,7 @@
                 <w:szCs w:val="20"/>
                 <w:lang w:eastAsia="es-CL"/>
               </w:rPr>
-              <w:t>Prepara el trabajo incremental.</w:t>
+              <w:t>Permite seguimiento por política.</w:t>
             </w:r>
           </w:p>
         </w:tc>
@@ -5335,7 +5772,7 @@
                 <w:szCs w:val="20"/>
                 <w:lang w:eastAsia="es-CL"/>
               </w:rPr>
-              <w:t>Programación / Arquitectura / Ciberseguridad</w:t>
+              <w:t>Programación / Arquitectura</w:t>
             </w:r>
           </w:p>
         </w:tc>
@@ -5372,7 +5809,7 @@
                 <w:szCs w:val="20"/>
                 <w:lang w:eastAsia="es-CL"/>
               </w:rPr>
-              <w:t xml:space="preserve">Desarrollo </w:t>
+              <w:t xml:space="preserve">Implementación </w:t>
             </w:r>
             <w:proofErr w:type="spellStart"/>
             <w:r>
@@ -5396,8 +5833,21 @@
                 <w:szCs w:val="20"/>
                 <w:lang w:eastAsia="es-CL"/>
               </w:rPr>
-              <w:t xml:space="preserve"> e integración técnica</w:t>
-            </w:r>
+              <w:t xml:space="preserve"> del </w:t>
+            </w:r>
+            <w:proofErr w:type="spellStart"/>
+            <w:r>
+              <w:rPr>
+                <w:rFonts w:ascii="Calibri" w:hAnsi="Calibri" w:cs="Arial"/>
+                <w:i/>
+                <w:color w:val="548DD4"/>
+                <w:sz w:val="20"/>
+                <w:szCs w:val="20"/>
+                <w:lang w:eastAsia="es-CL"/>
+              </w:rPr>
+              <w:t>framework</w:t>
+            </w:r>
+            <w:proofErr w:type="spellEnd"/>
           </w:p>
         </w:tc>
         <w:tc>
@@ -5433,7 +5883,7 @@
                 <w:szCs w:val="20"/>
                 <w:lang w:eastAsia="es-CL"/>
               </w:rPr>
-              <w:t xml:space="preserve">Implementar servicios, </w:t>
+              <w:t xml:space="preserve">Implementar modelos, servicios, </w:t>
             </w:r>
             <w:proofErr w:type="spellStart"/>
             <w:r>
@@ -5445,7 +5895,7 @@
                 <w:szCs w:val="20"/>
                 <w:lang w:eastAsia="es-CL"/>
               </w:rPr>
-              <w:t>APIs</w:t>
+              <w:t>endpoints</w:t>
             </w:r>
             <w:proofErr w:type="spellEnd"/>
             <w:r>
@@ -5457,7 +5907,7 @@
                 <w:szCs w:val="20"/>
                 <w:lang w:eastAsia="es-CL"/>
               </w:rPr>
-              <w:t xml:space="preserve">, datos, permisos y lógica requerida para ISO 42001, respetando </w:t>
+              <w:t xml:space="preserve">, permisos y trazabilidad para soportar </w:t>
             </w:r>
             <w:proofErr w:type="spellStart"/>
             <w:r>
@@ -5469,7 +5919,7 @@
                 <w:szCs w:val="20"/>
                 <w:lang w:eastAsia="es-CL"/>
               </w:rPr>
-              <w:t>multi-tenancy</w:t>
+              <w:t>frameworks</w:t>
             </w:r>
             <w:proofErr w:type="spellEnd"/>
             <w:r>
@@ -5481,7 +5931,7 @@
                 <w:szCs w:val="20"/>
                 <w:lang w:eastAsia="es-CL"/>
               </w:rPr>
-              <w:t>, RBAC/JWT y trazabilidad.</w:t>
+              <w:t xml:space="preserve"> y políticas.</w:t>
             </w:r>
           </w:p>
         </w:tc>
@@ -5555,7 +6005,7 @@
                 <w:szCs w:val="20"/>
                 <w:lang w:eastAsia="es-CL"/>
               </w:rPr>
-              <w:t>, Docker, Git/GitHub.</w:t>
+              <w:t>, Docker.</w:t>
             </w:r>
           </w:p>
         </w:tc>
@@ -5592,7 +6042,7 @@
                 <w:szCs w:val="20"/>
                 <w:lang w:eastAsia="es-CL"/>
               </w:rPr>
-              <w:t>S5-S13</w:t>
+              <w:t>S5-S9</w:t>
             </w:r>
           </w:p>
         </w:tc>
@@ -5666,7 +6116,7 @@
                 <w:szCs w:val="20"/>
                 <w:lang w:eastAsia="es-CL"/>
               </w:rPr>
-              <w:t>Desarrollo sobre la base existente.</w:t>
+              <w:t>Base reutilizable para ISO 42001 y futuras normas.</w:t>
             </w:r>
           </w:p>
         </w:tc>
@@ -5708,7 +6158,7 @@
                 <w:szCs w:val="20"/>
                 <w:lang w:eastAsia="es-CL"/>
               </w:rPr>
-              <w:t>Programación / Calidad de Software</w:t>
+              <w:t>Programación / Calidad</w:t>
             </w:r>
           </w:p>
         </w:tc>
@@ -5745,7 +6195,7 @@
                 <w:szCs w:val="20"/>
                 <w:lang w:eastAsia="es-CL"/>
               </w:rPr>
-              <w:t xml:space="preserve">Desarrollo </w:t>
+              <w:t xml:space="preserve">Implementación </w:t>
             </w:r>
             <w:proofErr w:type="spellStart"/>
             <w:r>
@@ -5769,8 +6219,21 @@
                 <w:szCs w:val="20"/>
                 <w:lang w:eastAsia="es-CL"/>
               </w:rPr>
-              <w:t xml:space="preserve"> y flujos funcionales</w:t>
-            </w:r>
+              <w:t xml:space="preserve"> del </w:t>
+            </w:r>
+            <w:proofErr w:type="spellStart"/>
+            <w:r>
+              <w:rPr>
+                <w:rFonts w:ascii="Calibri" w:hAnsi="Calibri" w:cs="Arial"/>
+                <w:i/>
+                <w:color w:val="548DD4"/>
+                <w:sz w:val="20"/>
+                <w:szCs w:val="20"/>
+                <w:lang w:eastAsia="es-CL"/>
+              </w:rPr>
+              <w:t>framework</w:t>
+            </w:r>
+            <w:proofErr w:type="spellEnd"/>
           </w:p>
         </w:tc>
         <w:tc>
@@ -5806,7 +6269,7 @@
                 <w:szCs w:val="20"/>
                 <w:lang w:eastAsia="es-CL"/>
               </w:rPr>
-              <w:t xml:space="preserve">Implementar interfaces y flujos de usuario para ISO 42001, integrándolos con las </w:t>
+              <w:t xml:space="preserve">Adaptar interfaces para seleccionar </w:t>
             </w:r>
             <w:proofErr w:type="spellStart"/>
             <w:r>
@@ -5818,7 +6281,7 @@
                 <w:szCs w:val="20"/>
                 <w:lang w:eastAsia="es-CL"/>
               </w:rPr>
-              <w:t>APIs</w:t>
+              <w:t>framework</w:t>
             </w:r>
             <w:proofErr w:type="spellEnd"/>
             <w:r>
@@ -5830,7 +6293,7 @@
                 <w:szCs w:val="20"/>
                 <w:lang w:eastAsia="es-CL"/>
               </w:rPr>
-              <w:t xml:space="preserve"> y considerando internacionalización y permisos.</w:t>
+              <w:t>, visualizar y gestionar políticas y estados asociados.</w:t>
             </w:r>
           </w:p>
         </w:tc>
@@ -5904,7 +6367,7 @@
                 <w:szCs w:val="20"/>
                 <w:lang w:eastAsia="es-CL"/>
               </w:rPr>
-              <w:t>, Git/GitHub, entorno de desarrollo.</w:t>
+              <w:t>, Git/GitHub.</w:t>
             </w:r>
           </w:p>
         </w:tc>
@@ -5941,7 +6404,7 @@
                 <w:szCs w:val="20"/>
                 <w:lang w:eastAsia="es-CL"/>
               </w:rPr>
-              <w:t>S5-S13</w:t>
+              <w:t>S5-S9</w:t>
             </w:r>
           </w:p>
         </w:tc>
@@ -6015,7 +6478,31 @@
                 <w:szCs w:val="20"/>
                 <w:lang w:eastAsia="es-CL"/>
               </w:rPr>
-              <w:t>Integración visual y funcional.</w:t>
+              <w:t xml:space="preserve">Experiencia de usuario para múltiples </w:t>
+            </w:r>
+            <w:proofErr w:type="spellStart"/>
+            <w:r>
+              <w:rPr>
+                <w:rFonts w:ascii="Calibri" w:hAnsi="Calibri" w:cs="Arial"/>
+                <w:i/>
+                <w:color w:val="548DD4"/>
+                <w:sz w:val="20"/>
+                <w:szCs w:val="20"/>
+                <w:lang w:eastAsia="es-CL"/>
+              </w:rPr>
+              <w:t>frameworks</w:t>
+            </w:r>
+            <w:proofErr w:type="spellEnd"/>
+            <w:r>
+              <w:rPr>
+                <w:rFonts w:ascii="Calibri" w:hAnsi="Calibri" w:cs="Arial"/>
+                <w:i/>
+                <w:color w:val="548DD4"/>
+                <w:sz w:val="20"/>
+                <w:szCs w:val="20"/>
+                <w:lang w:eastAsia="es-CL"/>
+              </w:rPr>
+              <w:t>.</w:t>
             </w:r>
           </w:p>
         </w:tc>
@@ -6057,7 +6544,7 @@
                 <w:szCs w:val="20"/>
                 <w:lang w:eastAsia="es-CL"/>
               </w:rPr>
-              <w:t>Arquitectura / Calidad de Software</w:t>
+              <w:t>Programación / Integración</w:t>
             </w:r>
           </w:p>
         </w:tc>
@@ -6094,7 +6581,7 @@
                 <w:szCs w:val="20"/>
                 <w:lang w:eastAsia="es-CL"/>
               </w:rPr>
-              <w:t>Integración técnica y estabilización</w:t>
+              <w:t>Carga e integración de políticas 1-10</w:t>
             </w:r>
           </w:p>
         </w:tc>
@@ -6131,55 +6618,7 @@
                 <w:szCs w:val="20"/>
                 <w:lang w:eastAsia="es-CL"/>
               </w:rPr>
-              <w:t xml:space="preserve">Integrar componentes </w:t>
-            </w:r>
-            <w:proofErr w:type="spellStart"/>
-            <w:r>
-              <w:rPr>
-                <w:rFonts w:ascii="Calibri" w:hAnsi="Calibri" w:cs="Arial"/>
-                <w:i/>
-                <w:color w:val="548DD4"/>
-                <w:sz w:val="20"/>
-                <w:szCs w:val="20"/>
-                <w:lang w:eastAsia="es-CL"/>
-              </w:rPr>
-              <w:t>backend</w:t>
-            </w:r>
-            <w:proofErr w:type="spellEnd"/>
-            <w:r>
-              <w:rPr>
-                <w:rFonts w:ascii="Calibri" w:hAnsi="Calibri" w:cs="Arial"/>
-                <w:i/>
-                <w:color w:val="548DD4"/>
-                <w:sz w:val="20"/>
-                <w:szCs w:val="20"/>
-                <w:lang w:eastAsia="es-CL"/>
-              </w:rPr>
-              <w:t>/</w:t>
-            </w:r>
-            <w:proofErr w:type="spellStart"/>
-            <w:r>
-              <w:rPr>
-                <w:rFonts w:ascii="Calibri" w:hAnsi="Calibri" w:cs="Arial"/>
-                <w:i/>
-                <w:color w:val="548DD4"/>
-                <w:sz w:val="20"/>
-                <w:szCs w:val="20"/>
-                <w:lang w:eastAsia="es-CL"/>
-              </w:rPr>
-              <w:t>frontend</w:t>
-            </w:r>
-            <w:proofErr w:type="spellEnd"/>
-            <w:r>
-              <w:rPr>
-                <w:rFonts w:ascii="Calibri" w:hAnsi="Calibri" w:cs="Arial"/>
-                <w:i/>
-                <w:color w:val="548DD4"/>
-                <w:sz w:val="20"/>
-                <w:szCs w:val="20"/>
-                <w:lang w:eastAsia="es-CL"/>
-              </w:rPr>
-              <w:t>, resolver incompatibilidades y verificar continuidad técnica de ISO 27001.</w:t>
+              <w:t>Parametrizar e integrar el primer bloque de políticas ISO 42001 en la solución.</w:t>
             </w:r>
           </w:p>
         </w:tc>
@@ -6216,7 +6655,7 @@
                 <w:szCs w:val="20"/>
                 <w:lang w:eastAsia="es-CL"/>
               </w:rPr>
-              <w:t>Entorno integrado, Docker, logs, repositorio.</w:t>
+              <w:t>Framework implementado, matriz ISO 42001.</w:t>
             </w:r>
           </w:p>
         </w:tc>
@@ -6253,7 +6692,7 @@
                 <w:szCs w:val="20"/>
                 <w:lang w:eastAsia="es-CL"/>
               </w:rPr>
-              <w:t>S14-S15</w:t>
+              <w:t>S10-S11</w:t>
             </w:r>
           </w:p>
         </w:tc>
@@ -6327,7 +6766,7 @@
                 <w:szCs w:val="20"/>
                 <w:lang w:eastAsia="es-CL"/>
               </w:rPr>
-              <w:t>Preparación para validación final.</w:t>
+              <w:t>Primer bloque funcional.</w:t>
             </w:r>
           </w:p>
         </w:tc>
@@ -6369,7 +6808,7 @@
                 <w:szCs w:val="20"/>
                 <w:lang w:eastAsia="es-CL"/>
               </w:rPr>
-              <w:t>Calidad de Software</w:t>
+              <w:t>Programación / Integración</w:t>
             </w:r>
           </w:p>
         </w:tc>
@@ -6406,7 +6845,7 @@
                 <w:szCs w:val="20"/>
                 <w:lang w:eastAsia="es-CL"/>
               </w:rPr>
-              <w:t>Validación funcional de integración</w:t>
+              <w:t>Carga e integración de políticas 11-20</w:t>
             </w:r>
           </w:p>
         </w:tc>
@@ -6443,19 +6882,7 @@
                 <w:szCs w:val="20"/>
                 <w:lang w:eastAsia="es-CL"/>
               </w:rPr>
-              <w:t xml:space="preserve">Validar flujos ISO 42001, permisos, criterios de aceptación e internacionalización sobre la </w:t>
-            </w:r>
-            <w:r>
-              <w:rPr>
-                <w:rFonts w:ascii="Calibri" w:hAnsi="Calibri" w:cs="Arial"/>
-                <w:i/>
-                <w:color w:val="548DD4"/>
-                <w:sz w:val="20"/>
-                <w:szCs w:val="20"/>
-                <w:lang w:eastAsia="es-CL"/>
-              </w:rPr>
-              <w:lastRenderedPageBreak/>
-              <w:t>solución integrada.</w:t>
+              <w:t>Parametrizar e integrar el segundo bloque de políticas ISO 42001 en la solución.</w:t>
             </w:r>
           </w:p>
         </w:tc>
@@ -6492,8 +6919,7 @@
                 <w:szCs w:val="20"/>
                 <w:lang w:eastAsia="es-CL"/>
               </w:rPr>
-              <w:lastRenderedPageBreak/>
-              <w:t>Casos de prueba, entorno integrado, backlog.</w:t>
+              <w:t>Framework implementado, matriz ISO 42001.</w:t>
             </w:r>
           </w:p>
         </w:tc>
@@ -6530,7 +6956,7 @@
                 <w:szCs w:val="20"/>
                 <w:lang w:eastAsia="es-CL"/>
               </w:rPr>
-              <w:t>S14-S15</w:t>
+              <w:t>S10-S11</w:t>
             </w:r>
           </w:p>
         </w:tc>
@@ -6604,45 +7030,1141 @@
                 <w:szCs w:val="20"/>
                 <w:lang w:eastAsia="es-CL"/>
               </w:rPr>
-              <w:t>Cierre funcional de Fase 2.</w:t>
+              <w:t>Completa las 20 políticas priorizadas.</w:t>
+            </w:r>
+          </w:p>
+        </w:tc>
+      </w:tr>
+      <w:tr>
+        <w:trPr>
+          <w:jc w:val="center"/>
+        </w:trPr>
+        <w:tc>
+          <w:tcPr>
+            <w:tcW w:w="1580" w:type="dxa"/>
+            <w:tcBorders>
+              <w:top w:val="single" w:sz="4" w:space="0" w:color="BFBFBF" w:themeColor="background1" w:themeShade="BF"/>
+              <w:left w:val="single" w:sz="4" w:space="0" w:color="BFBFBF" w:themeColor="background1" w:themeShade="BF"/>
+              <w:bottom w:val="single" w:sz="4" w:space="0" w:color="BFBFBF" w:themeColor="background1" w:themeShade="BF"/>
+              <w:right w:val="single" w:sz="4" w:space="0" w:color="BFBFBF" w:themeColor="background1" w:themeShade="BF"/>
+            </w:tcBorders>
+            <w:vAlign w:val="center"/>
+            <w:hideMark/>
+          </w:tcPr>
+          <w:p>
+            <w:pPr>
+              <w:jc w:val="both"/>
+              <w:rPr>
+                <w:rFonts w:ascii="Calibri" w:hAnsi="Calibri" w:cs="Arial"/>
+                <w:i/>
+                <w:color w:val="548DD4"/>
+                <w:sz w:val="20"/>
+                <w:szCs w:val="20"/>
+                <w:lang w:eastAsia="es-CL"/>
+              </w:rPr>
+            </w:pPr>
+            <w:r>
+              <w:rPr>
+                <w:rFonts w:ascii="Calibri" w:hAnsi="Calibri" w:cs="Arial"/>
+                <w:i/>
+                <w:color w:val="548DD4"/>
+                <w:sz w:val="20"/>
+                <w:szCs w:val="20"/>
+                <w:lang w:eastAsia="es-CL"/>
+              </w:rPr>
+              <w:t>Arquitectura / Calidad</w:t>
+            </w:r>
+          </w:p>
+        </w:tc>
+        <w:tc>
+          <w:tcPr>
+            <w:tcW w:w="1580" w:type="dxa"/>
+            <w:tcBorders>
+              <w:top w:val="single" w:sz="4" w:space="0" w:color="BFBFBF" w:themeColor="background1" w:themeShade="BF"/>
+              <w:left w:val="single" w:sz="4" w:space="0" w:color="BFBFBF" w:themeColor="background1" w:themeShade="BF"/>
+              <w:bottom w:val="single" w:sz="4" w:space="0" w:color="BFBFBF" w:themeColor="background1" w:themeShade="BF"/>
+              <w:right w:val="single" w:sz="4" w:space="0" w:color="BFBFBF" w:themeColor="background1" w:themeShade="BF"/>
+            </w:tcBorders>
+            <w:vAlign w:val="center"/>
+            <w:hideMark/>
+          </w:tcPr>
+          <w:p>
+            <w:pPr>
+              <w:jc w:val="both"/>
+              <w:rPr>
+                <w:rFonts w:ascii="Calibri" w:hAnsi="Calibri" w:cs="Arial"/>
+                <w:i/>
+                <w:color w:val="548DD4"/>
+                <w:sz w:val="20"/>
+                <w:szCs w:val="20"/>
+                <w:lang w:eastAsia="es-CL"/>
+              </w:rPr>
+            </w:pPr>
+            <w:r>
+              <w:rPr>
+                <w:rFonts w:ascii="Calibri" w:hAnsi="Calibri" w:cs="Arial"/>
+                <w:i/>
+                <w:color w:val="548DD4"/>
+                <w:sz w:val="20"/>
+                <w:szCs w:val="20"/>
+                <w:lang w:eastAsia="es-CL"/>
+              </w:rPr>
+              <w:t>Integración y estabilización técnica</w:t>
+            </w:r>
+          </w:p>
+        </w:tc>
+        <w:tc>
+          <w:tcPr>
+            <w:tcW w:w="1580" w:type="dxa"/>
+            <w:tcBorders>
+              <w:top w:val="single" w:sz="4" w:space="0" w:color="BFBFBF" w:themeColor="background1" w:themeShade="BF"/>
+              <w:left w:val="single" w:sz="4" w:space="0" w:color="BFBFBF" w:themeColor="background1" w:themeShade="BF"/>
+              <w:bottom w:val="single" w:sz="4" w:space="0" w:color="BFBFBF" w:themeColor="background1" w:themeShade="BF"/>
+              <w:right w:val="single" w:sz="4" w:space="0" w:color="BFBFBF" w:themeColor="background1" w:themeShade="BF"/>
+            </w:tcBorders>
+            <w:vAlign w:val="center"/>
+            <w:hideMark/>
+          </w:tcPr>
+          <w:p>
+            <w:pPr>
+              <w:jc w:val="both"/>
+              <w:rPr>
+                <w:rFonts w:ascii="Calibri" w:hAnsi="Calibri" w:cs="Arial"/>
+                <w:i/>
+                <w:color w:val="548DD4"/>
+                <w:sz w:val="20"/>
+                <w:szCs w:val="20"/>
+                <w:lang w:eastAsia="es-CL"/>
+              </w:rPr>
+            </w:pPr>
+            <w:r>
+              <w:rPr>
+                <w:rFonts w:ascii="Calibri" w:hAnsi="Calibri" w:cs="Arial"/>
+                <w:i/>
+                <w:color w:val="548DD4"/>
+                <w:sz w:val="20"/>
+                <w:szCs w:val="20"/>
+                <w:lang w:eastAsia="es-CL"/>
+              </w:rPr>
+              <w:t xml:space="preserve">Validar permisos, </w:t>
+            </w:r>
+            <w:proofErr w:type="spellStart"/>
+            <w:r>
+              <w:rPr>
+                <w:rFonts w:ascii="Calibri" w:hAnsi="Calibri" w:cs="Arial"/>
+                <w:i/>
+                <w:color w:val="548DD4"/>
+                <w:sz w:val="20"/>
+                <w:szCs w:val="20"/>
+                <w:lang w:eastAsia="es-CL"/>
+              </w:rPr>
+              <w:t>multi-tenancy</w:t>
+            </w:r>
+            <w:proofErr w:type="spellEnd"/>
+            <w:r>
+              <w:rPr>
+                <w:rFonts w:ascii="Calibri" w:hAnsi="Calibri" w:cs="Arial"/>
+                <w:i/>
+                <w:color w:val="548DD4"/>
+                <w:sz w:val="20"/>
+                <w:szCs w:val="20"/>
+                <w:lang w:eastAsia="es-CL"/>
+              </w:rPr>
+              <w:t xml:space="preserve">, </w:t>
+            </w:r>
+            <w:proofErr w:type="spellStart"/>
+            <w:r>
+              <w:rPr>
+                <w:rFonts w:ascii="Calibri" w:hAnsi="Calibri" w:cs="Arial"/>
+                <w:i/>
+                <w:color w:val="548DD4"/>
+                <w:sz w:val="20"/>
+                <w:szCs w:val="20"/>
+                <w:lang w:eastAsia="es-CL"/>
+              </w:rPr>
+              <w:t>APIs</w:t>
+            </w:r>
+            <w:proofErr w:type="spellEnd"/>
+            <w:r>
+              <w:rPr>
+                <w:rFonts w:ascii="Calibri" w:hAnsi="Calibri" w:cs="Arial"/>
+                <w:i/>
+                <w:color w:val="548DD4"/>
+                <w:sz w:val="20"/>
+                <w:szCs w:val="20"/>
+                <w:lang w:eastAsia="es-CL"/>
+              </w:rPr>
+              <w:t>, logs e interacción con módulos existentes.</w:t>
+            </w:r>
+          </w:p>
+        </w:tc>
+        <w:tc>
+          <w:tcPr>
+            <w:tcW w:w="1580" w:type="dxa"/>
+            <w:tcBorders>
+              <w:top w:val="single" w:sz="4" w:space="0" w:color="BFBFBF" w:themeColor="background1" w:themeShade="BF"/>
+              <w:left w:val="single" w:sz="4" w:space="0" w:color="BFBFBF" w:themeColor="background1" w:themeShade="BF"/>
+              <w:bottom w:val="single" w:sz="4" w:space="0" w:color="BFBFBF" w:themeColor="background1" w:themeShade="BF"/>
+              <w:right w:val="single" w:sz="4" w:space="0" w:color="BFBFBF" w:themeColor="background1" w:themeShade="BF"/>
+            </w:tcBorders>
+            <w:vAlign w:val="center"/>
+            <w:hideMark/>
+          </w:tcPr>
+          <w:p>
+            <w:pPr>
+              <w:jc w:val="both"/>
+              <w:rPr>
+                <w:rFonts w:ascii="Calibri" w:hAnsi="Calibri" w:cs="Arial"/>
+                <w:i/>
+                <w:color w:val="548DD4"/>
+                <w:sz w:val="20"/>
+                <w:szCs w:val="20"/>
+                <w:lang w:eastAsia="es-CL"/>
+              </w:rPr>
+            </w:pPr>
+            <w:r>
+              <w:rPr>
+                <w:rFonts w:ascii="Calibri" w:hAnsi="Calibri" w:cs="Arial"/>
+                <w:i/>
+                <w:color w:val="548DD4"/>
+                <w:sz w:val="20"/>
+                <w:szCs w:val="20"/>
+                <w:lang w:eastAsia="es-CL"/>
+              </w:rPr>
+              <w:t>Entorno integrado, Docker, logs.</w:t>
+            </w:r>
+          </w:p>
+        </w:tc>
+        <w:tc>
+          <w:tcPr>
+            <w:tcW w:w="1580" w:type="dxa"/>
+            <w:tcBorders>
+              <w:top w:val="single" w:sz="4" w:space="0" w:color="BFBFBF" w:themeColor="background1" w:themeShade="BF"/>
+              <w:left w:val="single" w:sz="4" w:space="0" w:color="BFBFBF" w:themeColor="background1" w:themeShade="BF"/>
+              <w:bottom w:val="single" w:sz="4" w:space="0" w:color="BFBFBF" w:themeColor="background1" w:themeShade="BF"/>
+              <w:right w:val="single" w:sz="4" w:space="0" w:color="BFBFBF" w:themeColor="background1" w:themeShade="BF"/>
+            </w:tcBorders>
+            <w:vAlign w:val="center"/>
+            <w:hideMark/>
+          </w:tcPr>
+          <w:p>
+            <w:pPr>
+              <w:jc w:val="both"/>
+              <w:rPr>
+                <w:rFonts w:ascii="Calibri" w:hAnsi="Calibri" w:cs="Arial"/>
+                <w:i/>
+                <w:color w:val="548DD4"/>
+                <w:sz w:val="20"/>
+                <w:szCs w:val="20"/>
+                <w:lang w:eastAsia="es-CL"/>
+              </w:rPr>
+            </w:pPr>
+            <w:r>
+              <w:rPr>
+                <w:rFonts w:ascii="Calibri" w:hAnsi="Calibri" w:cs="Arial"/>
+                <w:i/>
+                <w:color w:val="548DD4"/>
+                <w:sz w:val="20"/>
+                <w:szCs w:val="20"/>
+                <w:lang w:eastAsia="es-CL"/>
+              </w:rPr>
+              <w:t>S12-S15</w:t>
+            </w:r>
+          </w:p>
+        </w:tc>
+        <w:tc>
+          <w:tcPr>
+            <w:tcW w:w="1580" w:type="dxa"/>
+            <w:tcBorders>
+              <w:top w:val="single" w:sz="4" w:space="0" w:color="BFBFBF" w:themeColor="background1" w:themeShade="BF"/>
+              <w:left w:val="single" w:sz="4" w:space="0" w:color="BFBFBF" w:themeColor="background1" w:themeShade="BF"/>
+              <w:bottom w:val="single" w:sz="4" w:space="0" w:color="BFBFBF" w:themeColor="background1" w:themeShade="BF"/>
+              <w:right w:val="single" w:sz="4" w:space="0" w:color="BFBFBF" w:themeColor="background1" w:themeShade="BF"/>
+            </w:tcBorders>
+            <w:vAlign w:val="center"/>
+            <w:hideMark/>
+          </w:tcPr>
+          <w:p>
+            <w:pPr>
+              <w:jc w:val="both"/>
+              <w:rPr>
+                <w:rFonts w:ascii="Calibri" w:hAnsi="Calibri" w:cs="Arial"/>
+                <w:i/>
+                <w:color w:val="548DD4"/>
+                <w:sz w:val="20"/>
+                <w:szCs w:val="20"/>
+                <w:lang w:eastAsia="es-CL"/>
+              </w:rPr>
+            </w:pPr>
+            <w:r>
+              <w:rPr>
+                <w:rFonts w:ascii="Calibri" w:hAnsi="Calibri" w:cs="Arial"/>
+                <w:i/>
+                <w:color w:val="548DD4"/>
+                <w:sz w:val="20"/>
+                <w:szCs w:val="20"/>
+                <w:lang w:eastAsia="es-CL"/>
+              </w:rPr>
+              <w:t>Vicente Suazo</w:t>
+            </w:r>
+          </w:p>
+        </w:tc>
+        <w:tc>
+          <w:tcPr>
+            <w:tcW w:w="1581" w:type="dxa"/>
+            <w:tcBorders>
+              <w:top w:val="single" w:sz="4" w:space="0" w:color="BFBFBF" w:themeColor="background1" w:themeShade="BF"/>
+              <w:left w:val="single" w:sz="4" w:space="0" w:color="BFBFBF" w:themeColor="background1" w:themeShade="BF"/>
+              <w:bottom w:val="single" w:sz="4" w:space="0" w:color="BFBFBF" w:themeColor="background1" w:themeShade="BF"/>
+              <w:right w:val="single" w:sz="4" w:space="0" w:color="BFBFBF" w:themeColor="background1" w:themeShade="BF"/>
+            </w:tcBorders>
+            <w:vAlign w:val="center"/>
+            <w:hideMark/>
+          </w:tcPr>
+          <w:p>
+            <w:pPr>
+              <w:jc w:val="both"/>
+              <w:rPr>
+                <w:rFonts w:ascii="Calibri" w:hAnsi="Calibri" w:cs="Arial"/>
+                <w:i/>
+                <w:color w:val="548DD4"/>
+                <w:sz w:val="20"/>
+                <w:szCs w:val="20"/>
+                <w:lang w:eastAsia="es-CL"/>
+              </w:rPr>
+            </w:pPr>
+            <w:r>
+              <w:rPr>
+                <w:rFonts w:ascii="Calibri" w:hAnsi="Calibri" w:cs="Arial"/>
+                <w:i/>
+                <w:color w:val="548DD4"/>
+                <w:sz w:val="20"/>
+                <w:szCs w:val="20"/>
+                <w:lang w:eastAsia="es-CL"/>
+              </w:rPr>
+              <w:t>Asegura continuidad y trazabilidad.</w:t>
+            </w:r>
+          </w:p>
+        </w:tc>
+      </w:tr>
+      <w:tr>
+        <w:trPr>
+          <w:jc w:val="center"/>
+        </w:trPr>
+        <w:tc>
+          <w:tcPr>
+            <w:tcW w:w="1580" w:type="dxa"/>
+            <w:tcBorders>
+              <w:top w:val="single" w:sz="4" w:space="0" w:color="BFBFBF" w:themeColor="background1" w:themeShade="BF"/>
+              <w:left w:val="single" w:sz="4" w:space="0" w:color="BFBFBF" w:themeColor="background1" w:themeShade="BF"/>
+              <w:bottom w:val="single" w:sz="4" w:space="0" w:color="BFBFBF" w:themeColor="background1" w:themeShade="BF"/>
+              <w:right w:val="single" w:sz="4" w:space="0" w:color="BFBFBF" w:themeColor="background1" w:themeShade="BF"/>
+            </w:tcBorders>
+            <w:vAlign w:val="center"/>
+            <w:hideMark/>
+          </w:tcPr>
+          <w:p>
+            <w:pPr>
+              <w:jc w:val="both"/>
+              <w:rPr>
+                <w:rFonts w:ascii="Calibri" w:hAnsi="Calibri" w:cs="Arial"/>
+                <w:i/>
+                <w:color w:val="548DD4"/>
+                <w:sz w:val="20"/>
+                <w:szCs w:val="20"/>
+                <w:lang w:eastAsia="es-CL"/>
+              </w:rPr>
+            </w:pPr>
+            <w:r>
+              <w:rPr>
+                <w:rFonts w:ascii="Calibri" w:hAnsi="Calibri" w:cs="Arial"/>
+                <w:i/>
+                <w:color w:val="548DD4"/>
+                <w:sz w:val="20"/>
+                <w:szCs w:val="20"/>
+                <w:lang w:eastAsia="es-CL"/>
+              </w:rPr>
+              <w:lastRenderedPageBreak/>
+              <w:t>Calidad de Software</w:t>
+            </w:r>
+          </w:p>
+        </w:tc>
+        <w:tc>
+          <w:tcPr>
+            <w:tcW w:w="1580" w:type="dxa"/>
+            <w:tcBorders>
+              <w:top w:val="single" w:sz="4" w:space="0" w:color="BFBFBF" w:themeColor="background1" w:themeShade="BF"/>
+              <w:left w:val="single" w:sz="4" w:space="0" w:color="BFBFBF" w:themeColor="background1" w:themeShade="BF"/>
+              <w:bottom w:val="single" w:sz="4" w:space="0" w:color="BFBFBF" w:themeColor="background1" w:themeShade="BF"/>
+              <w:right w:val="single" w:sz="4" w:space="0" w:color="BFBFBF" w:themeColor="background1" w:themeShade="BF"/>
+            </w:tcBorders>
+            <w:vAlign w:val="center"/>
+            <w:hideMark/>
+          </w:tcPr>
+          <w:p>
+            <w:pPr>
+              <w:jc w:val="both"/>
+              <w:rPr>
+                <w:rFonts w:ascii="Calibri" w:hAnsi="Calibri" w:cs="Arial"/>
+                <w:i/>
+                <w:color w:val="548DD4"/>
+                <w:sz w:val="20"/>
+                <w:szCs w:val="20"/>
+                <w:lang w:eastAsia="es-CL"/>
+              </w:rPr>
+            </w:pPr>
+            <w:r>
+              <w:rPr>
+                <w:rFonts w:ascii="Calibri" w:hAnsi="Calibri" w:cs="Arial"/>
+                <w:i/>
+                <w:color w:val="548DD4"/>
+                <w:sz w:val="20"/>
+                <w:szCs w:val="20"/>
+                <w:lang w:eastAsia="es-CL"/>
+              </w:rPr>
+              <w:t>Validación funcional de las 20 políticas</w:t>
+            </w:r>
+          </w:p>
+        </w:tc>
+        <w:tc>
+          <w:tcPr>
+            <w:tcW w:w="1580" w:type="dxa"/>
+            <w:tcBorders>
+              <w:top w:val="single" w:sz="4" w:space="0" w:color="BFBFBF" w:themeColor="background1" w:themeShade="BF"/>
+              <w:left w:val="single" w:sz="4" w:space="0" w:color="BFBFBF" w:themeColor="background1" w:themeShade="BF"/>
+              <w:bottom w:val="single" w:sz="4" w:space="0" w:color="BFBFBF" w:themeColor="background1" w:themeShade="BF"/>
+              <w:right w:val="single" w:sz="4" w:space="0" w:color="BFBFBF" w:themeColor="background1" w:themeShade="BF"/>
+            </w:tcBorders>
+            <w:vAlign w:val="center"/>
+            <w:hideMark/>
+          </w:tcPr>
+          <w:p>
+            <w:pPr>
+              <w:jc w:val="both"/>
+              <w:rPr>
+                <w:rFonts w:ascii="Calibri" w:hAnsi="Calibri" w:cs="Arial"/>
+                <w:i/>
+                <w:color w:val="548DD4"/>
+                <w:sz w:val="20"/>
+                <w:szCs w:val="20"/>
+                <w:lang w:eastAsia="es-CL"/>
+              </w:rPr>
+            </w:pPr>
+            <w:r>
+              <w:rPr>
+                <w:rFonts w:ascii="Calibri" w:hAnsi="Calibri" w:cs="Arial"/>
+                <w:i/>
+                <w:color w:val="548DD4"/>
+                <w:sz w:val="20"/>
+                <w:szCs w:val="20"/>
+                <w:lang w:eastAsia="es-CL"/>
+              </w:rPr>
+              <w:t>Verificar criterios de aceptación, navegación, estados y comportamiento de cada política integrada.</w:t>
+            </w:r>
+          </w:p>
+        </w:tc>
+        <w:tc>
+          <w:tcPr>
+            <w:tcW w:w="1580" w:type="dxa"/>
+            <w:tcBorders>
+              <w:top w:val="single" w:sz="4" w:space="0" w:color="BFBFBF" w:themeColor="background1" w:themeShade="BF"/>
+              <w:left w:val="single" w:sz="4" w:space="0" w:color="BFBFBF" w:themeColor="background1" w:themeShade="BF"/>
+              <w:bottom w:val="single" w:sz="4" w:space="0" w:color="BFBFBF" w:themeColor="background1" w:themeShade="BF"/>
+              <w:right w:val="single" w:sz="4" w:space="0" w:color="BFBFBF" w:themeColor="background1" w:themeShade="BF"/>
+            </w:tcBorders>
+            <w:vAlign w:val="center"/>
+            <w:hideMark/>
+          </w:tcPr>
+          <w:p>
+            <w:pPr>
+              <w:jc w:val="both"/>
+              <w:rPr>
+                <w:rFonts w:ascii="Calibri" w:hAnsi="Calibri" w:cs="Arial"/>
+                <w:i/>
+                <w:color w:val="548DD4"/>
+                <w:sz w:val="20"/>
+                <w:szCs w:val="20"/>
+                <w:lang w:eastAsia="es-CL"/>
+              </w:rPr>
+            </w:pPr>
+            <w:r>
+              <w:rPr>
+                <w:rFonts w:ascii="Calibri" w:hAnsi="Calibri" w:cs="Arial"/>
+                <w:i/>
+                <w:color w:val="548DD4"/>
+                <w:sz w:val="20"/>
+                <w:szCs w:val="20"/>
+                <w:lang w:eastAsia="es-CL"/>
+              </w:rPr>
+              <w:t>Casos de prueba, matriz, backlog.</w:t>
+            </w:r>
+          </w:p>
+        </w:tc>
+        <w:tc>
+          <w:tcPr>
+            <w:tcW w:w="1580" w:type="dxa"/>
+            <w:tcBorders>
+              <w:top w:val="single" w:sz="4" w:space="0" w:color="BFBFBF" w:themeColor="background1" w:themeShade="BF"/>
+              <w:left w:val="single" w:sz="4" w:space="0" w:color="BFBFBF" w:themeColor="background1" w:themeShade="BF"/>
+              <w:bottom w:val="single" w:sz="4" w:space="0" w:color="BFBFBF" w:themeColor="background1" w:themeShade="BF"/>
+              <w:right w:val="single" w:sz="4" w:space="0" w:color="BFBFBF" w:themeColor="background1" w:themeShade="BF"/>
+            </w:tcBorders>
+            <w:vAlign w:val="center"/>
+            <w:hideMark/>
+          </w:tcPr>
+          <w:p>
+            <w:pPr>
+              <w:jc w:val="both"/>
+              <w:rPr>
+                <w:rFonts w:ascii="Calibri" w:hAnsi="Calibri" w:cs="Arial"/>
+                <w:i/>
+                <w:color w:val="548DD4"/>
+                <w:sz w:val="20"/>
+                <w:szCs w:val="20"/>
+                <w:lang w:eastAsia="es-CL"/>
+              </w:rPr>
+            </w:pPr>
+            <w:r>
+              <w:rPr>
+                <w:rFonts w:ascii="Calibri" w:hAnsi="Calibri" w:cs="Arial"/>
+                <w:i/>
+                <w:color w:val="548DD4"/>
+                <w:sz w:val="20"/>
+                <w:szCs w:val="20"/>
+                <w:lang w:eastAsia="es-CL"/>
+              </w:rPr>
+              <w:t>S12-S15</w:t>
+            </w:r>
+          </w:p>
+        </w:tc>
+        <w:tc>
+          <w:tcPr>
+            <w:tcW w:w="1580" w:type="dxa"/>
+            <w:tcBorders>
+              <w:top w:val="single" w:sz="4" w:space="0" w:color="BFBFBF" w:themeColor="background1" w:themeShade="BF"/>
+              <w:left w:val="single" w:sz="4" w:space="0" w:color="BFBFBF" w:themeColor="background1" w:themeShade="BF"/>
+              <w:bottom w:val="single" w:sz="4" w:space="0" w:color="BFBFBF" w:themeColor="background1" w:themeShade="BF"/>
+              <w:right w:val="single" w:sz="4" w:space="0" w:color="BFBFBF" w:themeColor="background1" w:themeShade="BF"/>
+            </w:tcBorders>
+            <w:vAlign w:val="center"/>
+            <w:hideMark/>
+          </w:tcPr>
+          <w:p>
+            <w:pPr>
+              <w:jc w:val="both"/>
+              <w:rPr>
+                <w:rFonts w:ascii="Calibri" w:hAnsi="Calibri" w:cs="Arial"/>
+                <w:i/>
+                <w:color w:val="548DD4"/>
+                <w:sz w:val="20"/>
+                <w:szCs w:val="20"/>
+                <w:lang w:eastAsia="es-CL"/>
+              </w:rPr>
+            </w:pPr>
+            <w:r>
+              <w:rPr>
+                <w:rFonts w:ascii="Calibri" w:hAnsi="Calibri" w:cs="Arial"/>
+                <w:i/>
+                <w:color w:val="548DD4"/>
+                <w:sz w:val="20"/>
+                <w:szCs w:val="20"/>
+                <w:lang w:eastAsia="es-CL"/>
+              </w:rPr>
+              <w:t>Andrea Santana</w:t>
+            </w:r>
+          </w:p>
+        </w:tc>
+        <w:tc>
+          <w:tcPr>
+            <w:tcW w:w="1581" w:type="dxa"/>
+            <w:tcBorders>
+              <w:top w:val="single" w:sz="4" w:space="0" w:color="BFBFBF" w:themeColor="background1" w:themeShade="BF"/>
+              <w:left w:val="single" w:sz="4" w:space="0" w:color="BFBFBF" w:themeColor="background1" w:themeShade="BF"/>
+              <w:bottom w:val="single" w:sz="4" w:space="0" w:color="BFBFBF" w:themeColor="background1" w:themeShade="BF"/>
+              <w:right w:val="single" w:sz="4" w:space="0" w:color="BFBFBF" w:themeColor="background1" w:themeShade="BF"/>
+            </w:tcBorders>
+            <w:vAlign w:val="center"/>
+            <w:hideMark/>
+          </w:tcPr>
+          <w:p>
+            <w:pPr>
+              <w:jc w:val="both"/>
+              <w:rPr>
+                <w:rFonts w:ascii="Calibri" w:hAnsi="Calibri" w:cs="Arial"/>
+                <w:i/>
+                <w:color w:val="548DD4"/>
+                <w:sz w:val="20"/>
+                <w:szCs w:val="20"/>
+                <w:lang w:eastAsia="es-CL"/>
+              </w:rPr>
+            </w:pPr>
+            <w:r>
+              <w:rPr>
+                <w:rFonts w:ascii="Calibri" w:hAnsi="Calibri" w:cs="Arial"/>
+                <w:i/>
+                <w:color w:val="548DD4"/>
+                <w:sz w:val="20"/>
+                <w:szCs w:val="20"/>
+                <w:lang w:eastAsia="es-CL"/>
+              </w:rPr>
+              <w:t>Confirma cobertura funcional del alcance.</w:t>
+            </w:r>
+          </w:p>
+        </w:tc>
+      </w:tr>
+      <w:tr>
+        <w:trPr>
+          <w:jc w:val="center"/>
+        </w:trPr>
+        <w:tc>
+          <w:tcPr>
+            <w:tcW w:w="1580" w:type="dxa"/>
+            <w:tcBorders>
+              <w:top w:val="single" w:sz="4" w:space="0" w:color="BFBFBF" w:themeColor="background1" w:themeShade="BF"/>
+              <w:left w:val="single" w:sz="4" w:space="0" w:color="BFBFBF" w:themeColor="background1" w:themeShade="BF"/>
+              <w:bottom w:val="single" w:sz="4" w:space="0" w:color="BFBFBF" w:themeColor="background1" w:themeShade="BF"/>
+              <w:right w:val="single" w:sz="4" w:space="0" w:color="BFBFBF" w:themeColor="background1" w:themeShade="BF"/>
+            </w:tcBorders>
+            <w:vAlign w:val="center"/>
+            <w:hideMark/>
+          </w:tcPr>
+          <w:p>
+            <w:pPr>
+              <w:jc w:val="both"/>
+              <w:rPr>
+                <w:rFonts w:ascii="Calibri" w:hAnsi="Calibri" w:cs="Arial"/>
+                <w:i/>
+                <w:color w:val="548DD4"/>
+                <w:sz w:val="20"/>
+                <w:szCs w:val="20"/>
+                <w:lang w:eastAsia="es-CL"/>
+              </w:rPr>
+            </w:pPr>
+            <w:r>
+              <w:rPr>
+                <w:rFonts w:ascii="Calibri" w:hAnsi="Calibri" w:cs="Arial"/>
+                <w:i/>
+                <w:color w:val="548DD4"/>
+                <w:sz w:val="20"/>
+                <w:szCs w:val="20"/>
+                <w:lang w:eastAsia="es-CL"/>
+              </w:rPr>
+              <w:t>Calidad / Arquitectura</w:t>
+            </w:r>
+          </w:p>
+        </w:tc>
+        <w:tc>
+          <w:tcPr>
+            <w:tcW w:w="1580" w:type="dxa"/>
+            <w:tcBorders>
+              <w:top w:val="single" w:sz="4" w:space="0" w:color="BFBFBF" w:themeColor="background1" w:themeShade="BF"/>
+              <w:left w:val="single" w:sz="4" w:space="0" w:color="BFBFBF" w:themeColor="background1" w:themeShade="BF"/>
+              <w:bottom w:val="single" w:sz="4" w:space="0" w:color="BFBFBF" w:themeColor="background1" w:themeShade="BF"/>
+              <w:right w:val="single" w:sz="4" w:space="0" w:color="BFBFBF" w:themeColor="background1" w:themeShade="BF"/>
+            </w:tcBorders>
+            <w:vAlign w:val="center"/>
+            <w:hideMark/>
+          </w:tcPr>
+          <w:p>
+            <w:pPr>
+              <w:jc w:val="both"/>
+              <w:rPr>
+                <w:rFonts w:ascii="Calibri" w:hAnsi="Calibri" w:cs="Arial"/>
+                <w:i/>
+                <w:color w:val="548DD4"/>
+                <w:sz w:val="20"/>
+                <w:szCs w:val="20"/>
+                <w:lang w:eastAsia="es-CL"/>
+              </w:rPr>
+            </w:pPr>
+            <w:r>
+              <w:rPr>
+                <w:rFonts w:ascii="Calibri" w:hAnsi="Calibri" w:cs="Arial"/>
+                <w:i/>
+                <w:color w:val="548DD4"/>
+                <w:sz w:val="20"/>
+                <w:szCs w:val="20"/>
+                <w:lang w:eastAsia="es-CL"/>
+              </w:rPr>
+              <w:t>Pruebas de regresión y correcciones</w:t>
+            </w:r>
+          </w:p>
+        </w:tc>
+        <w:tc>
+          <w:tcPr>
+            <w:tcW w:w="1580" w:type="dxa"/>
+            <w:tcBorders>
+              <w:top w:val="single" w:sz="4" w:space="0" w:color="BFBFBF" w:themeColor="background1" w:themeShade="BF"/>
+              <w:left w:val="single" w:sz="4" w:space="0" w:color="BFBFBF" w:themeColor="background1" w:themeShade="BF"/>
+              <w:bottom w:val="single" w:sz="4" w:space="0" w:color="BFBFBF" w:themeColor="background1" w:themeShade="BF"/>
+              <w:right w:val="single" w:sz="4" w:space="0" w:color="BFBFBF" w:themeColor="background1" w:themeShade="BF"/>
+            </w:tcBorders>
+            <w:vAlign w:val="center"/>
+            <w:hideMark/>
+          </w:tcPr>
+          <w:p>
+            <w:pPr>
+              <w:jc w:val="both"/>
+              <w:rPr>
+                <w:rFonts w:ascii="Calibri" w:hAnsi="Calibri" w:cs="Arial"/>
+                <w:i/>
+                <w:color w:val="548DD4"/>
+                <w:sz w:val="20"/>
+                <w:szCs w:val="20"/>
+                <w:lang w:eastAsia="es-CL"/>
+              </w:rPr>
+            </w:pPr>
+            <w:r>
+              <w:rPr>
+                <w:rFonts w:ascii="Calibri" w:hAnsi="Calibri" w:cs="Arial"/>
+                <w:i/>
+                <w:color w:val="548DD4"/>
+                <w:sz w:val="20"/>
+                <w:szCs w:val="20"/>
+                <w:lang w:eastAsia="es-CL"/>
+              </w:rPr>
+              <w:t>Ejecutar pruebas de integración/regresión y corregir hallazgos técnicos.</w:t>
+            </w:r>
+          </w:p>
+        </w:tc>
+        <w:tc>
+          <w:tcPr>
+            <w:tcW w:w="1580" w:type="dxa"/>
+            <w:tcBorders>
+              <w:top w:val="single" w:sz="4" w:space="0" w:color="BFBFBF" w:themeColor="background1" w:themeShade="BF"/>
+              <w:left w:val="single" w:sz="4" w:space="0" w:color="BFBFBF" w:themeColor="background1" w:themeShade="BF"/>
+              <w:bottom w:val="single" w:sz="4" w:space="0" w:color="BFBFBF" w:themeColor="background1" w:themeShade="BF"/>
+              <w:right w:val="single" w:sz="4" w:space="0" w:color="BFBFBF" w:themeColor="background1" w:themeShade="BF"/>
+            </w:tcBorders>
+            <w:vAlign w:val="center"/>
+            <w:hideMark/>
+          </w:tcPr>
+          <w:p>
+            <w:pPr>
+              <w:jc w:val="both"/>
+              <w:rPr>
+                <w:rFonts w:ascii="Calibri" w:hAnsi="Calibri" w:cs="Arial"/>
+                <w:i/>
+                <w:color w:val="548DD4"/>
+                <w:sz w:val="20"/>
+                <w:szCs w:val="20"/>
+                <w:lang w:eastAsia="es-CL"/>
+              </w:rPr>
+            </w:pPr>
+            <w:r>
+              <w:rPr>
+                <w:rFonts w:ascii="Calibri" w:hAnsi="Calibri" w:cs="Arial"/>
+                <w:i/>
+                <w:color w:val="548DD4"/>
+                <w:sz w:val="20"/>
+                <w:szCs w:val="20"/>
+                <w:lang w:eastAsia="es-CL"/>
+              </w:rPr>
+              <w:t>Entorno de pruebas, Git/GitHub, logs.</w:t>
+            </w:r>
+          </w:p>
+        </w:tc>
+        <w:tc>
+          <w:tcPr>
+            <w:tcW w:w="1580" w:type="dxa"/>
+            <w:tcBorders>
+              <w:top w:val="single" w:sz="4" w:space="0" w:color="BFBFBF" w:themeColor="background1" w:themeShade="BF"/>
+              <w:left w:val="single" w:sz="4" w:space="0" w:color="BFBFBF" w:themeColor="background1" w:themeShade="BF"/>
+              <w:bottom w:val="single" w:sz="4" w:space="0" w:color="BFBFBF" w:themeColor="background1" w:themeShade="BF"/>
+              <w:right w:val="single" w:sz="4" w:space="0" w:color="BFBFBF" w:themeColor="background1" w:themeShade="BF"/>
+            </w:tcBorders>
+            <w:vAlign w:val="center"/>
+            <w:hideMark/>
+          </w:tcPr>
+          <w:p>
+            <w:pPr>
+              <w:jc w:val="both"/>
+              <w:rPr>
+                <w:rFonts w:ascii="Calibri" w:hAnsi="Calibri" w:cs="Arial"/>
+                <w:i/>
+                <w:color w:val="548DD4"/>
+                <w:sz w:val="20"/>
+                <w:szCs w:val="20"/>
+                <w:lang w:eastAsia="es-CL"/>
+              </w:rPr>
+            </w:pPr>
+            <w:r>
+              <w:rPr>
+                <w:rFonts w:ascii="Calibri" w:hAnsi="Calibri" w:cs="Arial"/>
+                <w:i/>
+                <w:color w:val="548DD4"/>
+                <w:sz w:val="20"/>
+                <w:szCs w:val="20"/>
+                <w:lang w:eastAsia="es-CL"/>
+              </w:rPr>
+              <w:t>S16-S18</w:t>
+            </w:r>
+          </w:p>
+        </w:tc>
+        <w:tc>
+          <w:tcPr>
+            <w:tcW w:w="1580" w:type="dxa"/>
+            <w:tcBorders>
+              <w:top w:val="single" w:sz="4" w:space="0" w:color="BFBFBF" w:themeColor="background1" w:themeShade="BF"/>
+              <w:left w:val="single" w:sz="4" w:space="0" w:color="BFBFBF" w:themeColor="background1" w:themeShade="BF"/>
+              <w:bottom w:val="single" w:sz="4" w:space="0" w:color="BFBFBF" w:themeColor="background1" w:themeShade="BF"/>
+              <w:right w:val="single" w:sz="4" w:space="0" w:color="BFBFBF" w:themeColor="background1" w:themeShade="BF"/>
+            </w:tcBorders>
+            <w:vAlign w:val="center"/>
+            <w:hideMark/>
+          </w:tcPr>
+          <w:p>
+            <w:pPr>
+              <w:jc w:val="both"/>
+              <w:rPr>
+                <w:rFonts w:ascii="Calibri" w:hAnsi="Calibri" w:cs="Arial"/>
+                <w:i/>
+                <w:color w:val="548DD4"/>
+                <w:sz w:val="20"/>
+                <w:szCs w:val="20"/>
+                <w:lang w:eastAsia="es-CL"/>
+              </w:rPr>
+            </w:pPr>
+            <w:r>
+              <w:rPr>
+                <w:rFonts w:ascii="Calibri" w:hAnsi="Calibri" w:cs="Arial"/>
+                <w:i/>
+                <w:color w:val="548DD4"/>
+                <w:sz w:val="20"/>
+                <w:szCs w:val="20"/>
+                <w:lang w:eastAsia="es-CL"/>
+              </w:rPr>
+              <w:t>Vicente Suazo</w:t>
+            </w:r>
+          </w:p>
+        </w:tc>
+        <w:tc>
+          <w:tcPr>
+            <w:tcW w:w="1581" w:type="dxa"/>
+            <w:tcBorders>
+              <w:top w:val="single" w:sz="4" w:space="0" w:color="BFBFBF" w:themeColor="background1" w:themeShade="BF"/>
+              <w:left w:val="single" w:sz="4" w:space="0" w:color="BFBFBF" w:themeColor="background1" w:themeShade="BF"/>
+              <w:bottom w:val="single" w:sz="4" w:space="0" w:color="BFBFBF" w:themeColor="background1" w:themeShade="BF"/>
+              <w:right w:val="single" w:sz="4" w:space="0" w:color="BFBFBF" w:themeColor="background1" w:themeShade="BF"/>
+            </w:tcBorders>
+            <w:vAlign w:val="center"/>
+            <w:hideMark/>
+          </w:tcPr>
+          <w:p>
+            <w:pPr>
+              <w:jc w:val="both"/>
+              <w:rPr>
+                <w:rFonts w:ascii="Calibri" w:hAnsi="Calibri" w:cs="Arial"/>
+                <w:i/>
+                <w:color w:val="548DD4"/>
+                <w:sz w:val="20"/>
+                <w:szCs w:val="20"/>
+                <w:lang w:eastAsia="es-CL"/>
+              </w:rPr>
+            </w:pPr>
+            <w:r>
+              <w:rPr>
+                <w:rFonts w:ascii="Calibri" w:hAnsi="Calibri" w:cs="Arial"/>
+                <w:i/>
+                <w:color w:val="548DD4"/>
+                <w:sz w:val="20"/>
+                <w:szCs w:val="20"/>
+                <w:lang w:eastAsia="es-CL"/>
+              </w:rPr>
+              <w:t>Verifica estabilidad de DANI27.</w:t>
+            </w:r>
+          </w:p>
+        </w:tc>
+      </w:tr>
+      <w:tr>
+        <w:trPr>
+          <w:jc w:val="center"/>
+        </w:trPr>
+        <w:tc>
+          <w:tcPr>
+            <w:tcW w:w="1580" w:type="dxa"/>
+            <w:tcBorders>
+              <w:top w:val="single" w:sz="4" w:space="0" w:color="BFBFBF" w:themeColor="background1" w:themeShade="BF"/>
+              <w:left w:val="single" w:sz="4" w:space="0" w:color="BFBFBF" w:themeColor="background1" w:themeShade="BF"/>
+              <w:bottom w:val="single" w:sz="4" w:space="0" w:color="BFBFBF" w:themeColor="background1" w:themeShade="BF"/>
+              <w:right w:val="single" w:sz="4" w:space="0" w:color="BFBFBF" w:themeColor="background1" w:themeShade="BF"/>
+            </w:tcBorders>
+            <w:vAlign w:val="center"/>
+            <w:hideMark/>
+          </w:tcPr>
+          <w:p>
+            <w:pPr>
+              <w:jc w:val="both"/>
+              <w:rPr>
+                <w:rFonts w:ascii="Calibri" w:hAnsi="Calibri" w:cs="Arial"/>
+                <w:i/>
+                <w:color w:val="548DD4"/>
+                <w:sz w:val="20"/>
+                <w:szCs w:val="20"/>
+                <w:lang w:eastAsia="es-CL"/>
+              </w:rPr>
+            </w:pPr>
+            <w:r>
+              <w:rPr>
+                <w:rFonts w:ascii="Calibri" w:hAnsi="Calibri" w:cs="Arial"/>
+                <w:i/>
+                <w:color w:val="548DD4"/>
+                <w:sz w:val="20"/>
+                <w:szCs w:val="20"/>
+                <w:lang w:eastAsia="es-CL"/>
+              </w:rPr>
+              <w:t>Calidad / Gestión de Proyecto</w:t>
+            </w:r>
+          </w:p>
+        </w:tc>
+        <w:tc>
+          <w:tcPr>
+            <w:tcW w:w="1580" w:type="dxa"/>
+            <w:tcBorders>
+              <w:top w:val="single" w:sz="4" w:space="0" w:color="BFBFBF" w:themeColor="background1" w:themeShade="BF"/>
+              <w:left w:val="single" w:sz="4" w:space="0" w:color="BFBFBF" w:themeColor="background1" w:themeShade="BF"/>
+              <w:bottom w:val="single" w:sz="4" w:space="0" w:color="BFBFBF" w:themeColor="background1" w:themeShade="BF"/>
+              <w:right w:val="single" w:sz="4" w:space="0" w:color="BFBFBF" w:themeColor="background1" w:themeShade="BF"/>
+            </w:tcBorders>
+            <w:vAlign w:val="center"/>
+            <w:hideMark/>
+          </w:tcPr>
+          <w:p>
+            <w:pPr>
+              <w:jc w:val="both"/>
+              <w:rPr>
+                <w:rFonts w:ascii="Calibri" w:hAnsi="Calibri" w:cs="Arial"/>
+                <w:i/>
+                <w:color w:val="548DD4"/>
+                <w:sz w:val="20"/>
+                <w:szCs w:val="20"/>
+                <w:lang w:eastAsia="es-CL"/>
+              </w:rPr>
+            </w:pPr>
+            <w:r>
+              <w:rPr>
+                <w:rFonts w:ascii="Calibri" w:hAnsi="Calibri" w:cs="Arial"/>
+                <w:i/>
+                <w:color w:val="548DD4"/>
+                <w:sz w:val="20"/>
+                <w:szCs w:val="20"/>
+                <w:lang w:eastAsia="es-CL"/>
+              </w:rPr>
+              <w:t>Evidencias y documentación final</w:t>
+            </w:r>
+          </w:p>
+        </w:tc>
+        <w:tc>
+          <w:tcPr>
+            <w:tcW w:w="1580" w:type="dxa"/>
+            <w:tcBorders>
+              <w:top w:val="single" w:sz="4" w:space="0" w:color="BFBFBF" w:themeColor="background1" w:themeShade="BF"/>
+              <w:left w:val="single" w:sz="4" w:space="0" w:color="BFBFBF" w:themeColor="background1" w:themeShade="BF"/>
+              <w:bottom w:val="single" w:sz="4" w:space="0" w:color="BFBFBF" w:themeColor="background1" w:themeShade="BF"/>
+              <w:right w:val="single" w:sz="4" w:space="0" w:color="BFBFBF" w:themeColor="background1" w:themeShade="BF"/>
+            </w:tcBorders>
+            <w:vAlign w:val="center"/>
+            <w:hideMark/>
+          </w:tcPr>
+          <w:p>
+            <w:pPr>
+              <w:jc w:val="both"/>
+              <w:rPr>
+                <w:rFonts w:ascii="Calibri" w:hAnsi="Calibri" w:cs="Arial"/>
+                <w:i/>
+                <w:color w:val="548DD4"/>
+                <w:sz w:val="20"/>
+                <w:szCs w:val="20"/>
+                <w:lang w:eastAsia="es-CL"/>
+              </w:rPr>
+            </w:pPr>
+            <w:r>
+              <w:rPr>
+                <w:rFonts w:ascii="Calibri" w:hAnsi="Calibri" w:cs="Arial"/>
+                <w:i/>
+                <w:color w:val="548DD4"/>
+                <w:sz w:val="20"/>
+                <w:szCs w:val="20"/>
+                <w:lang w:eastAsia="es-CL"/>
+              </w:rPr>
+              <w:t xml:space="preserve">Consolidar pruebas, evidencias, matriz de cobertura y guía para incorporar futuros </w:t>
+            </w:r>
+            <w:proofErr w:type="spellStart"/>
+            <w:r>
+              <w:rPr>
+                <w:rFonts w:ascii="Calibri" w:hAnsi="Calibri" w:cs="Arial"/>
+                <w:i/>
+                <w:color w:val="548DD4"/>
+                <w:sz w:val="20"/>
+                <w:szCs w:val="20"/>
+                <w:lang w:eastAsia="es-CL"/>
+              </w:rPr>
+              <w:t>frameworks</w:t>
+            </w:r>
+            <w:proofErr w:type="spellEnd"/>
+            <w:r>
+              <w:rPr>
+                <w:rFonts w:ascii="Calibri" w:hAnsi="Calibri" w:cs="Arial"/>
+                <w:i/>
+                <w:color w:val="548DD4"/>
+                <w:sz w:val="20"/>
+                <w:szCs w:val="20"/>
+                <w:lang w:eastAsia="es-CL"/>
+              </w:rPr>
+              <w:t>.</w:t>
+            </w:r>
+          </w:p>
+        </w:tc>
+        <w:tc>
+          <w:tcPr>
+            <w:tcW w:w="1580" w:type="dxa"/>
+            <w:tcBorders>
+              <w:top w:val="single" w:sz="4" w:space="0" w:color="BFBFBF" w:themeColor="background1" w:themeShade="BF"/>
+              <w:left w:val="single" w:sz="4" w:space="0" w:color="BFBFBF" w:themeColor="background1" w:themeShade="BF"/>
+              <w:bottom w:val="single" w:sz="4" w:space="0" w:color="BFBFBF" w:themeColor="background1" w:themeShade="BF"/>
+              <w:right w:val="single" w:sz="4" w:space="0" w:color="BFBFBF" w:themeColor="background1" w:themeShade="BF"/>
+            </w:tcBorders>
+            <w:vAlign w:val="center"/>
+            <w:hideMark/>
+          </w:tcPr>
+          <w:p>
+            <w:pPr>
+              <w:jc w:val="both"/>
+              <w:rPr>
+                <w:rFonts w:ascii="Calibri" w:hAnsi="Calibri" w:cs="Arial"/>
+                <w:i/>
+                <w:color w:val="548DD4"/>
+                <w:sz w:val="20"/>
+                <w:szCs w:val="20"/>
+                <w:lang w:eastAsia="es-CL"/>
+              </w:rPr>
+            </w:pPr>
+            <w:r>
+              <w:rPr>
+                <w:rFonts w:ascii="Calibri" w:hAnsi="Calibri" w:cs="Arial"/>
+                <w:i/>
+                <w:color w:val="548DD4"/>
+                <w:sz w:val="20"/>
+                <w:szCs w:val="20"/>
+                <w:lang w:eastAsia="es-CL"/>
+              </w:rPr>
+              <w:t>Documentación, evidencias, backlog.</w:t>
+            </w:r>
+          </w:p>
+        </w:tc>
+        <w:tc>
+          <w:tcPr>
+            <w:tcW w:w="1580" w:type="dxa"/>
+            <w:tcBorders>
+              <w:top w:val="single" w:sz="4" w:space="0" w:color="BFBFBF" w:themeColor="background1" w:themeShade="BF"/>
+              <w:left w:val="single" w:sz="4" w:space="0" w:color="BFBFBF" w:themeColor="background1" w:themeShade="BF"/>
+              <w:bottom w:val="single" w:sz="4" w:space="0" w:color="BFBFBF" w:themeColor="background1" w:themeShade="BF"/>
+              <w:right w:val="single" w:sz="4" w:space="0" w:color="BFBFBF" w:themeColor="background1" w:themeShade="BF"/>
+            </w:tcBorders>
+            <w:vAlign w:val="center"/>
+            <w:hideMark/>
+          </w:tcPr>
+          <w:p>
+            <w:pPr>
+              <w:jc w:val="both"/>
+              <w:rPr>
+                <w:rFonts w:ascii="Calibri" w:hAnsi="Calibri" w:cs="Arial"/>
+                <w:i/>
+                <w:color w:val="548DD4"/>
+                <w:sz w:val="20"/>
+                <w:szCs w:val="20"/>
+                <w:lang w:eastAsia="es-CL"/>
+              </w:rPr>
+            </w:pPr>
+            <w:r>
+              <w:rPr>
+                <w:rFonts w:ascii="Calibri" w:hAnsi="Calibri" w:cs="Arial"/>
+                <w:i/>
+                <w:color w:val="548DD4"/>
+                <w:sz w:val="20"/>
+                <w:szCs w:val="20"/>
+                <w:lang w:eastAsia="es-CL"/>
+              </w:rPr>
+              <w:t>S16-S18</w:t>
+            </w:r>
+          </w:p>
+        </w:tc>
+        <w:tc>
+          <w:tcPr>
+            <w:tcW w:w="1580" w:type="dxa"/>
+            <w:tcBorders>
+              <w:top w:val="single" w:sz="4" w:space="0" w:color="BFBFBF" w:themeColor="background1" w:themeShade="BF"/>
+              <w:left w:val="single" w:sz="4" w:space="0" w:color="BFBFBF" w:themeColor="background1" w:themeShade="BF"/>
+              <w:bottom w:val="single" w:sz="4" w:space="0" w:color="BFBFBF" w:themeColor="background1" w:themeShade="BF"/>
+              <w:right w:val="single" w:sz="4" w:space="0" w:color="BFBFBF" w:themeColor="background1" w:themeShade="BF"/>
+            </w:tcBorders>
+            <w:vAlign w:val="center"/>
+            <w:hideMark/>
+          </w:tcPr>
+          <w:p>
+            <w:pPr>
+              <w:jc w:val="both"/>
+              <w:rPr>
+                <w:rFonts w:ascii="Calibri" w:hAnsi="Calibri" w:cs="Arial"/>
+                <w:i/>
+                <w:color w:val="548DD4"/>
+                <w:sz w:val="20"/>
+                <w:szCs w:val="20"/>
+                <w:lang w:eastAsia="es-CL"/>
+              </w:rPr>
+            </w:pPr>
+            <w:r>
+              <w:rPr>
+                <w:rFonts w:ascii="Calibri" w:hAnsi="Calibri" w:cs="Arial"/>
+                <w:i/>
+                <w:color w:val="548DD4"/>
+                <w:sz w:val="20"/>
+                <w:szCs w:val="20"/>
+                <w:lang w:eastAsia="es-CL"/>
+              </w:rPr>
+              <w:t>Andrea Santana</w:t>
+            </w:r>
+          </w:p>
+        </w:tc>
+        <w:tc>
+          <w:tcPr>
+            <w:tcW w:w="1581" w:type="dxa"/>
+            <w:tcBorders>
+              <w:top w:val="single" w:sz="4" w:space="0" w:color="BFBFBF" w:themeColor="background1" w:themeShade="BF"/>
+              <w:left w:val="single" w:sz="4" w:space="0" w:color="BFBFBF" w:themeColor="background1" w:themeShade="BF"/>
+              <w:bottom w:val="single" w:sz="4" w:space="0" w:color="BFBFBF" w:themeColor="background1" w:themeShade="BF"/>
+              <w:right w:val="single" w:sz="4" w:space="0" w:color="BFBFBF" w:themeColor="background1" w:themeShade="BF"/>
+            </w:tcBorders>
+            <w:vAlign w:val="center"/>
+            <w:hideMark/>
+          </w:tcPr>
+          <w:p>
+            <w:pPr>
+              <w:jc w:val="both"/>
+              <w:rPr>
+                <w:rFonts w:ascii="Calibri" w:hAnsi="Calibri" w:cs="Arial"/>
+                <w:i/>
+                <w:color w:val="548DD4"/>
+                <w:sz w:val="20"/>
+                <w:szCs w:val="20"/>
+                <w:lang w:eastAsia="es-CL"/>
+              </w:rPr>
+            </w:pPr>
+            <w:r>
+              <w:rPr>
+                <w:rFonts w:ascii="Calibri" w:hAnsi="Calibri" w:cs="Arial"/>
+                <w:i/>
+                <w:color w:val="548DD4"/>
+                <w:sz w:val="20"/>
+                <w:szCs w:val="20"/>
+                <w:lang w:eastAsia="es-CL"/>
+              </w:rPr>
+              <w:t>Cierre y trazabilidad del proyecto.</w:t>
             </w:r>
           </w:p>
         </w:tc>
       </w:tr>
     </w:tbl>
-    <w:p>
-      <w:pPr>
-        <w:spacing w:after="0" w:line="360" w:lineRule="auto"/>
-        <w:jc w:val="both"/>
-        <w:rPr>
-          <w:b/>
-          <w:sz w:val="24"/>
-          <w:szCs w:val="24"/>
-        </w:rPr>
-      </w:pPr>
-    </w:p>
-    <w:p>
-      <w:pPr>
-        <w:spacing w:after="0" w:line="360" w:lineRule="auto"/>
-        <w:jc w:val="both"/>
-        <w:rPr>
-          <w:b/>
-          <w:sz w:val="24"/>
-          <w:szCs w:val="24"/>
-        </w:rPr>
-      </w:pPr>
-    </w:p>
-    <w:p>
-      <w:pPr>
-        <w:spacing w:after="0" w:line="360" w:lineRule="auto"/>
-        <w:jc w:val="both"/>
-        <w:rPr>
-          <w:b/>
-          <w:sz w:val="24"/>
-          <w:szCs w:val="24"/>
-        </w:rPr>
-      </w:pPr>
-    </w:p>
     <w:p>
       <w:pPr>
         <w:spacing w:after="0" w:line="360" w:lineRule="auto"/>
@@ -6790,26 +8312,15 @@
       </w:pPr>
     </w:p>
     <w:p>
-      <w:pPr>
-        <w:spacing w:after="0" w:line="360" w:lineRule="auto"/>
-        <w:jc w:val="both"/>
-        <w:rPr>
-          <w:b/>
-          <w:sz w:val="24"/>
-          <w:szCs w:val="24"/>
-        </w:rPr>
-      </w:pPr>
-    </w:p>
-    <w:p>
       <w:r>
         <w:rPr>
           <w:noProof/>
         </w:rPr>
         <w:drawing>
-          <wp:inline distT="0" distB="0" distL="0" distR="0" wp14:anchorId="0997D0C0" wp14:editId="2759F3E3">
-            <wp:extent cx="5686643" cy="2446112"/>
-            <wp:effectExtent l="0" t="0" r="9525" b="0"/>
-            <wp:docPr id="48" name="Picture 48"/>
+          <wp:inline distT="0" distB="0" distL="0" distR="0" wp14:anchorId="28285956" wp14:editId="1F8755D4">
+            <wp:extent cx="5400040" cy="2856424"/>
+            <wp:effectExtent l="0" t="0" r="0" b="1270"/>
+            <wp:docPr id="49" name="Picture 49"/>
             <wp:cNvGraphicFramePr>
               <a:graphicFrameLocks xmlns:a="http://schemas.openxmlformats.org/drawingml/2006/main" noChangeAspect="1"/>
             </wp:cNvGraphicFramePr>
@@ -6817,10 +8328,8 @@
               <a:graphicData uri="http://schemas.openxmlformats.org/drawingml/2006/picture">
                 <pic:pic xmlns:pic="http://schemas.openxmlformats.org/drawingml/2006/picture">
                   <pic:nvPicPr>
-                    <pic:cNvPr id="48" name="Picture 48"/>
-                    <pic:cNvPicPr>
-                      <a:picLocks noChangeAspect="1"/>
-                    </pic:cNvPicPr>
+                    <pic:cNvPr id="0" name="gantt_iso42001_20_politicas.png"/>
+                    <pic:cNvPicPr/>
                   </pic:nvPicPr>
                   <pic:blipFill>
                     <a:blip r:embed="rId10"/>
@@ -6831,7 +8340,7 @@
                   <pic:spPr>
                     <a:xfrm>
                       <a:off x="0" y="0"/>
-                      <a:ext cx="5691644" cy="2448263"/>
+                      <a:ext cx="5400040" cy="2856424"/>
                     </a:xfrm>
                     <a:prstGeom prst="rect">
                       <a:avLst/>
@@ -8549,21 +10058,6 @@
 </file>
 
 <file path=customXml/item1.xml><?xml version="1.0" encoding="utf-8"?>
-<p:properties xmlns:p="http://schemas.microsoft.com/office/2006/metadata/properties" xmlns:xsi="http://www.w3.org/2001/XMLSchema-instance" xmlns:pc="http://schemas.microsoft.com/office/infopath/2007/PartnerControls">
-  <documentManagement/>
-</p:properties>
-</file>
-
-<file path=customXml/item2.xml><?xml version="1.0" encoding="utf-8"?>
-<?mso-contentType ?>
-<FormTemplates xmlns="http://schemas.microsoft.com/sharepoint/v3/contenttype/forms">
-  <Display>DocumentLibraryForm</Display>
-  <Edit>DocumentLibraryForm</Edit>
-  <New>DocumentLibraryForm</New>
-</FormTemplates>
-</file>
-
-<file path=customXml/item3.xml><?xml version="1.0" encoding="utf-8"?>
 <ct:contentTypeSchema xmlns:ct="http://schemas.microsoft.com/office/2006/metadata/contentType" xmlns:ma="http://schemas.microsoft.com/office/2006/metadata/properties/metaAttributes" ct:_="" ma:_="" ma:contentTypeName="Documento" ma:contentTypeID="0x010100E96778489EE7714D8BD12CC105EB918B" ma:contentTypeVersion="2" ma:contentTypeDescription="Crear nuevo documento." ma:contentTypeScope="" ma:versionID="416c5c7ae9b5d54d83875cd3c65194e3">
   <xsd:schema xmlns:xsd="http://www.w3.org/2001/XMLSchema" xmlns:xs="http://www.w3.org/2001/XMLSchema" xmlns:p="http://schemas.microsoft.com/office/2006/metadata/properties" xmlns:ns2="126e8a1c-9ea9-435a-ac89-d06c80d62e30" targetNamespace="http://schemas.microsoft.com/office/2006/metadata/properties" ma:root="true" ma:fieldsID="70a237c842677bd850644f8595079f5e" ns2:_="">
     <xsd:import namespace="126e8a1c-9ea9-435a-ac89-d06c80d62e30"/>
@@ -8695,24 +10189,22 @@
 </ct:contentTypeSchema>
 </file>
 
-<file path=customXml/itemProps1.xml><?xml version="1.0" encoding="utf-8"?>
-<ds:datastoreItem xmlns:ds="http://schemas.openxmlformats.org/officeDocument/2006/customXml" ds:itemID="{38174882-579A-45DC-A704-C035A9357F73}">
-  <ds:schemaRefs>
-    <ds:schemaRef ds:uri="http://schemas.microsoft.com/office/2006/metadata/properties"/>
-    <ds:schemaRef ds:uri="http://schemas.microsoft.com/office/infopath/2007/PartnerControls"/>
-  </ds:schemaRefs>
-</ds:datastoreItem>
+<file path=customXml/item2.xml><?xml version="1.0" encoding="utf-8"?>
+<?mso-contentType ?>
+<FormTemplates xmlns="http://schemas.microsoft.com/sharepoint/v3/contenttype/forms">
+  <Display>DocumentLibraryForm</Display>
+  <Edit>DocumentLibraryForm</Edit>
+  <New>DocumentLibraryForm</New>
+</FormTemplates>
 </file>
 
-<file path=customXml/itemProps2.xml><?xml version="1.0" encoding="utf-8"?>
-<ds:datastoreItem xmlns:ds="http://schemas.openxmlformats.org/officeDocument/2006/customXml" ds:itemID="{F3E3E2F7-59E7-4722-B872-D023DC9D1CC1}">
-  <ds:schemaRefs>
-    <ds:schemaRef ds:uri="http://schemas.microsoft.com/sharepoint/v3/contenttype/forms"/>
-  </ds:schemaRefs>
-</ds:datastoreItem>
+<file path=customXml/item3.xml><?xml version="1.0" encoding="utf-8"?>
+<p:properties xmlns:p="http://schemas.microsoft.com/office/2006/metadata/properties" xmlns:xsi="http://www.w3.org/2001/XMLSchema-instance" xmlns:pc="http://schemas.microsoft.com/office/infopath/2007/PartnerControls">
+  <documentManagement/>
+</p:properties>
 </file>
 
-<file path=customXml/itemProps3.xml><?xml version="1.0" encoding="utf-8"?>
+<file path=customXml/itemProps1.xml><?xml version="1.0" encoding="utf-8"?>
 <ds:datastoreItem xmlns:ds="http://schemas.openxmlformats.org/officeDocument/2006/customXml" ds:itemID="{7C9B9CFF-B258-43B4-948A-968A031773F5}">
   <ds:schemaRefs>
     <ds:schemaRef ds:uri="http://schemas.microsoft.com/office/2006/metadata/contentType"/>
@@ -8728,4 +10220,21 @@
     <ds:schemaRef ds:uri="http://schemas.microsoft.com/internal/obd"/>
   </ds:schemaRefs>
 </ds:datastoreItem>
+</file>
+
+<file path=customXml/itemProps2.xml><?xml version="1.0" encoding="utf-8"?>
+<ds:datastoreItem xmlns:ds="http://schemas.openxmlformats.org/officeDocument/2006/customXml" ds:itemID="{F3E3E2F7-59E7-4722-B872-D023DC9D1CC1}">
+  <ds:schemaRefs>
+    <ds:schemaRef ds:uri="http://schemas.microsoft.com/sharepoint/v3/contenttype/forms"/>
+  </ds:schemaRefs>
+</ds:datastoreItem>
+</file>
+
+<file path=customXml/itemProps3.xml><?xml version="1.0" encoding="utf-8"?>
+<ds:datastoreItem xmlns:ds="http://schemas.openxmlformats.org/officeDocument/2006/customXml" ds:itemID="{38174882-579A-45DC-A704-C035A9357F73}">
+  <ds:schemaRefs>
+    <ds:schemaRef ds:uri="http://schemas.microsoft.com/office/2006/metadata/properties"/>
+    <ds:schemaRef ds:uri="http://schemas.microsoft.com/office/infopath/2007/PartnerControls"/>
+  </ds:schemaRefs>
+</ds:datastoreItem>
 </file>
</xml_diff>